<commit_message>
M1: template binder + render proof — dummy data renders into KKU template ✓
</commit_message>
<xml_diff>
--- a/templates/kku_lesson_plan.docx
+++ b/templates/kku_lesson_plan.docx
@@ -41,7 +41,7 @@
           <w:b/>
           <w:sz w:val="28"/>
         </w:rPr>
-        <w:t>ภาคการศึกษา ................ ปีการศึกษา ................</w:t>
+        <w:t>ภาคการศึกษา {{ semester }} ปีการศึกษา {{ academicYear }}</w:t>
       </w:r>
     </w:p>
     <w:p>
@@ -55,7 +55,7 @@
           <w:b w:val="0"/>
           <w:sz w:val="28"/>
         </w:rPr>
-        <w:t>รหัสวิชาและชื่อวิชา  ............................................................................................................................</w:t>
+        <w:t>รหัสวิชาและชื่อวิชา  {{ courseCode }} {{ courseName }}</w:t>
       </w:r>
     </w:p>
     <w:p>
@@ -69,7 +69,7 @@
           <w:b w:val="0"/>
           <w:sz w:val="28"/>
         </w:rPr>
-        <w:t>หัวข้อเรื่อง  ...........................................................................        จำนวน ............ ชั่วโมง</w:t>
+        <w:t>หัวข้อเรื่อง  {{ lectureTopic }}        จำนวน {{ totalDurationHours }} ชั่วโมง</w:t>
       </w:r>
     </w:p>
     <w:p>
@@ -83,7 +83,7 @@
           <w:b w:val="0"/>
           <w:sz w:val="28"/>
         </w:rPr>
-        <w:t>ผู้เรียน  ............................................................................................................................</w:t>
+        <w:t>ผู้เรียน  {{ learners }}</w:t>
       </w:r>
     </w:p>
     <w:p>
@@ -97,7 +97,7 @@
           <w:b w:val="0"/>
           <w:sz w:val="28"/>
         </w:rPr>
-        <w:t>อาจารย์ผู้สอน  ...........................................................      สังกัด สาขาวิชา ...........................................</w:t>
+        <w:t>อาจารย์ผู้สอน  {{ instructorName }}      สังกัด สาขาวิชา {{ department }}</w:t>
       </w:r>
     </w:p>
     <w:p>
@@ -111,7 +111,7 @@
           <w:b w:val="0"/>
           <w:sz w:val="28"/>
         </w:rPr>
-        <w:t>วันที่ ......................................................   เวลา ......................................................</w:t>
+        <w:t>วันที่ {{ sessionDate }}   เวลา {{ sessionTime }}</w:t>
       </w:r>
     </w:p>
     <w:tbl>
@@ -402,6 +402,66 @@
         </w:tc>
       </w:tr>
       <w:tr>
+        <w:tc>
+          <w:tcPr>
+            <w:tcW w:type="dxa" w:w="1644"/>
+          </w:tcPr>
+          <w:p>
+            <w:r>
+              <w:t>{%tr for kp in keyPoints %}</w:t>
+            </w:r>
+          </w:p>
+        </w:tc>
+        <w:tc>
+          <w:tcPr>
+            <w:tcW w:type="dxa" w:w="1644"/>
+          </w:tcPr>
+          <w:p/>
+        </w:tc>
+        <w:tc>
+          <w:tcPr>
+            <w:tcW w:type="dxa" w:w="1644"/>
+          </w:tcPr>
+          <w:p/>
+        </w:tc>
+        <w:tc>
+          <w:tcPr>
+            <w:tcW w:type="dxa" w:w="1644"/>
+          </w:tcPr>
+          <w:p/>
+        </w:tc>
+        <w:tc>
+          <w:tcPr>
+            <w:tcW w:type="dxa" w:w="1644"/>
+          </w:tcPr>
+          <w:p/>
+        </w:tc>
+        <w:tc>
+          <w:tcPr>
+            <w:tcW w:type="dxa" w:w="1644"/>
+          </w:tcPr>
+          <w:p/>
+        </w:tc>
+        <w:tc>
+          <w:tcPr>
+            <w:tcW w:type="dxa" w:w="1644"/>
+          </w:tcPr>
+          <w:p/>
+        </w:tc>
+        <w:tc>
+          <w:tcPr>
+            <w:tcW w:type="dxa" w:w="1644"/>
+          </w:tcPr>
+          <w:p/>
+        </w:tc>
+        <w:tc>
+          <w:tcPr>
+            <w:tcW w:type="dxa" w:w="1644"/>
+          </w:tcPr>
+          <w:p/>
+        </w:tc>
+      </w:tr>
+      <w:tr>
         <w:trPr>
           <w:trHeight w:val="520" w:hRule="atLeast"/>
         </w:trPr>
@@ -414,14 +474,15 @@
               <w:spacing w:after="0" w:before="0" w:line="240" w:lineRule="auto"/>
               <w:jc w:val="left"/>
             </w:pPr>
-            <w:r/>
+            <w:r>
+              <w:t>{{ kp.timeLabel }}</w:t>
+            </w:r>
             <w:r>
               <w:rPr>
                 <w:rFonts w:ascii="TH Sarabun New" w:hAnsi="TH Sarabun New" w:cs="TH Sarabun New"/>
                 <w:b w:val="0"/>
                 <w:sz w:val="24"/>
               </w:rPr>
-              <w:t xml:space="preserve"> </w:t>
             </w:r>
           </w:p>
           <w:p>
@@ -448,14 +509,15 @@
               <w:spacing w:after="0" w:before="0" w:line="240" w:lineRule="auto"/>
               <w:jc w:val="left"/>
             </w:pPr>
-            <w:r/>
+            <w:r>
+              <w:t>{{ kp.title }}</w:t>
+            </w:r>
             <w:r>
               <w:rPr>
                 <w:rFonts w:ascii="TH Sarabun New" w:hAnsi="TH Sarabun New" w:cs="TH Sarabun New"/>
                 <w:b w:val="0"/>
                 <w:sz w:val="24"/>
               </w:rPr>
-              <w:t xml:space="preserve"> </w:t>
             </w:r>
           </w:p>
           <w:p>
@@ -482,14 +544,15 @@
               <w:spacing w:after="0" w:before="0" w:line="240" w:lineRule="auto"/>
               <w:jc w:val="left"/>
             </w:pPr>
-            <w:r/>
+            <w:r>
+              <w:t>{{ kp.durationMin }}</w:t>
+            </w:r>
             <w:r>
               <w:rPr>
                 <w:rFonts w:ascii="TH Sarabun New" w:hAnsi="TH Sarabun New" w:cs="TH Sarabun New"/>
                 <w:b w:val="0"/>
                 <w:sz w:val="24"/>
               </w:rPr>
-              <w:t xml:space="preserve"> </w:t>
             </w:r>
           </w:p>
           <w:p>
@@ -516,14 +579,15 @@
               <w:spacing w:after="0" w:before="0" w:line="240" w:lineRule="auto"/>
               <w:jc w:val="left"/>
             </w:pPr>
-            <w:r/>
+            <w:r>
+              <w:t>{{ kp.cloRefsText }}</w:t>
+            </w:r>
             <w:r>
               <w:rPr>
                 <w:rFonts w:ascii="TH Sarabun New" w:hAnsi="TH Sarabun New" w:cs="TH Sarabun New"/>
                 <w:b w:val="0"/>
                 <w:sz w:val="24"/>
               </w:rPr>
-              <w:t xml:space="preserve"> </w:t>
             </w:r>
           </w:p>
           <w:p>
@@ -550,14 +614,15 @@
               <w:spacing w:after="0" w:before="0" w:line="240" w:lineRule="auto"/>
               <w:jc w:val="left"/>
             </w:pPr>
-            <w:r/>
+            <w:r>
+              <w:t>{{ kp.objective }}</w:t>
+            </w:r>
             <w:r>
               <w:rPr>
                 <w:rFonts w:ascii="TH Sarabun New" w:hAnsi="TH Sarabun New" w:cs="TH Sarabun New"/>
                 <w:b w:val="0"/>
                 <w:sz w:val="24"/>
               </w:rPr>
-              <w:t xml:space="preserve"> </w:t>
             </w:r>
           </w:p>
           <w:p>
@@ -584,14 +649,15 @@
               <w:spacing w:after="0" w:before="0" w:line="240" w:lineRule="auto"/>
               <w:jc w:val="left"/>
             </w:pPr>
-            <w:r/>
+            <w:r>
+              <w:t>{{ kp.content }}</w:t>
+            </w:r>
             <w:r>
               <w:rPr>
                 <w:rFonts w:ascii="TH Sarabun New" w:hAnsi="TH Sarabun New" w:cs="TH Sarabun New"/>
                 <w:b w:val="0"/>
                 <w:sz w:val="24"/>
               </w:rPr>
-              <w:t xml:space="preserve"> </w:t>
             </w:r>
           </w:p>
           <w:p>
@@ -618,14 +684,15 @@
               <w:spacing w:after="0" w:before="0" w:line="240" w:lineRule="auto"/>
               <w:jc w:val="left"/>
             </w:pPr>
-            <w:r/>
+            <w:r>
+              <w:t>{{ kp.teachingMethod }}</w:t>
+            </w:r>
             <w:r>
               <w:rPr>
                 <w:rFonts w:ascii="TH Sarabun New" w:hAnsi="TH Sarabun New" w:cs="TH Sarabun New"/>
                 <w:b w:val="0"/>
                 <w:sz w:val="24"/>
               </w:rPr>
-              <w:t xml:space="preserve"> </w:t>
             </w:r>
           </w:p>
           <w:p>
@@ -652,14 +719,15 @@
               <w:spacing w:after="0" w:before="0" w:line="240" w:lineRule="auto"/>
               <w:jc w:val="left"/>
             </w:pPr>
-            <w:r/>
+            <w:r>
+              <w:t>{{ kp.materials }}</w:t>
+            </w:r>
             <w:r>
               <w:rPr>
                 <w:rFonts w:ascii="TH Sarabun New" w:hAnsi="TH Sarabun New" w:cs="TH Sarabun New"/>
                 <w:b w:val="0"/>
                 <w:sz w:val="24"/>
               </w:rPr>
-              <w:t xml:space="preserve"> </w:t>
             </w:r>
           </w:p>
           <w:p>
@@ -686,14 +754,15 @@
               <w:spacing w:after="0" w:before="0" w:line="240" w:lineRule="auto"/>
               <w:jc w:val="left"/>
             </w:pPr>
-            <w:r/>
+            <w:r>
+              <w:t>{{ kp.assessment }}</w:t>
+            </w:r>
             <w:r>
               <w:rPr>
                 <w:rFonts w:ascii="TH Sarabun New" w:hAnsi="TH Sarabun New" w:cs="TH Sarabun New"/>
                 <w:b w:val="0"/>
                 <w:sz w:val="24"/>
               </w:rPr>
-              <w:t xml:space="preserve"> </w:t>
             </w:r>
           </w:p>
           <w:p>
@@ -713,2802 +782,63 @@
         </w:tc>
       </w:tr>
       <w:tr>
-        <w:trPr>
-          <w:trHeight w:val="520" w:hRule="atLeast"/>
-        </w:trPr>
         <w:tc>
           <w:tcPr>
-            <w:tcW w:type="dxa" w:w="1474"/>
+            <w:tcW w:type="dxa" w:w="1644"/>
           </w:tcPr>
           <w:p>
-            <w:pPr>
-              <w:spacing w:after="0" w:before="0" w:line="240" w:lineRule="auto"/>
-              <w:jc w:val="left"/>
-            </w:pPr>
-            <w:r/>
             <w:r>
-              <w:rPr>
-                <w:rFonts w:ascii="TH Sarabun New" w:hAnsi="TH Sarabun New" w:cs="TH Sarabun New"/>
-                <w:b w:val="0"/>
-                <w:sz w:val="24"/>
-              </w:rPr>
-              <w:t xml:space="preserve"> </w:t>
-            </w:r>
-          </w:p>
-          <w:p>
-            <w:pPr>
-              <w:spacing w:after="0" w:before="0" w:line="240" w:lineRule="auto"/>
-              <w:jc w:val="left"/>
-            </w:pPr>
-            <w:r>
-              <w:rPr>
-                <w:rFonts w:ascii="TH Sarabun New" w:hAnsi="TH Sarabun New" w:cs="TH Sarabun New"/>
-                <w:b w:val="0"/>
-                <w:sz w:val="24"/>
-              </w:rPr>
-              <w:t xml:space="preserve"> </w:t>
+              <w:t>{%tr endfor %}</w:t>
             </w:r>
           </w:p>
         </w:tc>
         <w:tc>
           <w:tcPr>
-            <w:tcW w:type="dxa" w:w="2211"/>
+            <w:tcW w:type="dxa" w:w="1644"/>
           </w:tcPr>
-          <w:p>
-            <w:pPr>
-              <w:spacing w:after="0" w:before="0" w:line="240" w:lineRule="auto"/>
-              <w:jc w:val="left"/>
-            </w:pPr>
-            <w:r/>
-            <w:r>
-              <w:rPr>
-                <w:rFonts w:ascii="TH Sarabun New" w:hAnsi="TH Sarabun New" w:cs="TH Sarabun New"/>
-                <w:b w:val="0"/>
-                <w:sz w:val="24"/>
-              </w:rPr>
-              <w:t xml:space="preserve"> </w:t>
-            </w:r>
-          </w:p>
-          <w:p>
-            <w:pPr>
-              <w:spacing w:after="0" w:before="0" w:line="240" w:lineRule="auto"/>
-              <w:jc w:val="left"/>
-            </w:pPr>
-            <w:r>
-              <w:rPr>
-                <w:rFonts w:ascii="TH Sarabun New" w:hAnsi="TH Sarabun New" w:cs="TH Sarabun New"/>
-                <w:b w:val="0"/>
-                <w:sz w:val="24"/>
-              </w:rPr>
-              <w:t xml:space="preserve"> </w:t>
-            </w:r>
-          </w:p>
+          <w:p/>
         </w:tc>
         <w:tc>
           <w:tcPr>
-            <w:tcW w:type="dxa" w:w="624"/>
+            <w:tcW w:type="dxa" w:w="1644"/>
           </w:tcPr>
-          <w:p>
-            <w:pPr>
-              <w:spacing w:after="0" w:before="0" w:line="240" w:lineRule="auto"/>
-              <w:jc w:val="left"/>
-            </w:pPr>
-            <w:r/>
-            <w:r>
-              <w:rPr>
-                <w:rFonts w:ascii="TH Sarabun New" w:hAnsi="TH Sarabun New" w:cs="TH Sarabun New"/>
-                <w:b w:val="0"/>
-                <w:sz w:val="24"/>
-              </w:rPr>
-              <w:t xml:space="preserve"> </w:t>
-            </w:r>
-          </w:p>
-          <w:p>
-            <w:pPr>
-              <w:spacing w:after="0" w:before="0" w:line="240" w:lineRule="auto"/>
-              <w:jc w:val="left"/>
-            </w:pPr>
-            <w:r>
-              <w:rPr>
-                <w:rFonts w:ascii="TH Sarabun New" w:hAnsi="TH Sarabun New" w:cs="TH Sarabun New"/>
-                <w:b w:val="0"/>
-                <w:sz w:val="24"/>
-              </w:rPr>
-              <w:t xml:space="preserve"> </w:t>
-            </w:r>
-          </w:p>
+          <w:p/>
         </w:tc>
         <w:tc>
           <w:tcPr>
-            <w:tcW w:type="dxa" w:w="794"/>
+            <w:tcW w:type="dxa" w:w="1644"/>
           </w:tcPr>
-          <w:p>
-            <w:pPr>
-              <w:spacing w:after="0" w:before="0" w:line="240" w:lineRule="auto"/>
-              <w:jc w:val="left"/>
-            </w:pPr>
-            <w:r/>
-            <w:r>
-              <w:rPr>
-                <w:rFonts w:ascii="TH Sarabun New" w:hAnsi="TH Sarabun New" w:cs="TH Sarabun New"/>
-                <w:b w:val="0"/>
-                <w:sz w:val="24"/>
-              </w:rPr>
-              <w:t xml:space="preserve"> </w:t>
-            </w:r>
-          </w:p>
-          <w:p>
-            <w:pPr>
-              <w:spacing w:after="0" w:before="0" w:line="240" w:lineRule="auto"/>
-              <w:jc w:val="left"/>
-            </w:pPr>
-            <w:r>
-              <w:rPr>
-                <w:rFonts w:ascii="TH Sarabun New" w:hAnsi="TH Sarabun New" w:cs="TH Sarabun New"/>
-                <w:b w:val="0"/>
-                <w:sz w:val="24"/>
-              </w:rPr>
-              <w:t xml:space="preserve"> </w:t>
-            </w:r>
-          </w:p>
+          <w:p/>
         </w:tc>
         <w:tc>
           <w:tcPr>
-            <w:tcW w:type="dxa" w:w="2438"/>
+            <w:tcW w:type="dxa" w:w="1644"/>
           </w:tcPr>
-          <w:p>
-            <w:pPr>
-              <w:spacing w:after="0" w:before="0" w:line="240" w:lineRule="auto"/>
-              <w:jc w:val="left"/>
-            </w:pPr>
-            <w:r/>
-            <w:r>
-              <w:rPr>
-                <w:rFonts w:ascii="TH Sarabun New" w:hAnsi="TH Sarabun New" w:cs="TH Sarabun New"/>
-                <w:b w:val="0"/>
-                <w:sz w:val="24"/>
-              </w:rPr>
-              <w:t xml:space="preserve"> </w:t>
-            </w:r>
-          </w:p>
-          <w:p>
-            <w:pPr>
-              <w:spacing w:after="0" w:before="0" w:line="240" w:lineRule="auto"/>
-              <w:jc w:val="left"/>
-            </w:pPr>
-            <w:r>
-              <w:rPr>
-                <w:rFonts w:ascii="TH Sarabun New" w:hAnsi="TH Sarabun New" w:cs="TH Sarabun New"/>
-                <w:b w:val="0"/>
-                <w:sz w:val="24"/>
-              </w:rPr>
-              <w:t xml:space="preserve"> </w:t>
-            </w:r>
-          </w:p>
+          <w:p/>
         </w:tc>
         <w:tc>
           <w:tcPr>
-            <w:tcW w:type="dxa" w:w="2665"/>
+            <w:tcW w:type="dxa" w:w="1644"/>
           </w:tcPr>
-          <w:p>
-            <w:pPr>
-              <w:spacing w:after="0" w:before="0" w:line="240" w:lineRule="auto"/>
-              <w:jc w:val="left"/>
-            </w:pPr>
-            <w:r/>
-            <w:r>
-              <w:rPr>
-                <w:rFonts w:ascii="TH Sarabun New" w:hAnsi="TH Sarabun New" w:cs="TH Sarabun New"/>
-                <w:b w:val="0"/>
-                <w:sz w:val="24"/>
-              </w:rPr>
-              <w:t xml:space="preserve"> </w:t>
-            </w:r>
-          </w:p>
-          <w:p>
-            <w:pPr>
-              <w:spacing w:after="0" w:before="0" w:line="240" w:lineRule="auto"/>
-              <w:jc w:val="left"/>
-            </w:pPr>
-            <w:r>
-              <w:rPr>
-                <w:rFonts w:ascii="TH Sarabun New" w:hAnsi="TH Sarabun New" w:cs="TH Sarabun New"/>
-                <w:b w:val="0"/>
-                <w:sz w:val="24"/>
-              </w:rPr>
-              <w:t xml:space="preserve"> </w:t>
-            </w:r>
-          </w:p>
+          <w:p/>
         </w:tc>
         <w:tc>
           <w:tcPr>
-            <w:tcW w:type="dxa" w:w="1871"/>
+            <w:tcW w:type="dxa" w:w="1644"/>
           </w:tcPr>
-          <w:p>
-            <w:pPr>
-              <w:spacing w:after="0" w:before="0" w:line="240" w:lineRule="auto"/>
-              <w:jc w:val="left"/>
-            </w:pPr>
-            <w:r/>
-            <w:r>
-              <w:rPr>
-                <w:rFonts w:ascii="TH Sarabun New" w:hAnsi="TH Sarabun New" w:cs="TH Sarabun New"/>
-                <w:b w:val="0"/>
-                <w:sz w:val="24"/>
-              </w:rPr>
-              <w:t xml:space="preserve"> </w:t>
-            </w:r>
-          </w:p>
-          <w:p>
-            <w:pPr>
-              <w:spacing w:after="0" w:before="0" w:line="240" w:lineRule="auto"/>
-              <w:jc w:val="left"/>
-            </w:pPr>
-            <w:r>
-              <w:rPr>
-                <w:rFonts w:ascii="TH Sarabun New" w:hAnsi="TH Sarabun New" w:cs="TH Sarabun New"/>
-                <w:b w:val="0"/>
-                <w:sz w:val="24"/>
-              </w:rPr>
-              <w:t xml:space="preserve"> </w:t>
-            </w:r>
-          </w:p>
+          <w:p/>
         </w:tc>
         <w:tc>
           <w:tcPr>
-            <w:tcW w:type="dxa" w:w="1701"/>
+            <w:tcW w:type="dxa" w:w="1644"/>
           </w:tcPr>
-          <w:p>
-            <w:pPr>
-              <w:spacing w:after="0" w:before="0" w:line="240" w:lineRule="auto"/>
-              <w:jc w:val="left"/>
-            </w:pPr>
-            <w:r/>
-            <w:r>
-              <w:rPr>
-                <w:rFonts w:ascii="TH Sarabun New" w:hAnsi="TH Sarabun New" w:cs="TH Sarabun New"/>
-                <w:b w:val="0"/>
-                <w:sz w:val="24"/>
-              </w:rPr>
-              <w:t xml:space="preserve"> </w:t>
-            </w:r>
-          </w:p>
-          <w:p>
-            <w:pPr>
-              <w:spacing w:after="0" w:before="0" w:line="240" w:lineRule="auto"/>
-              <w:jc w:val="left"/>
-            </w:pPr>
-            <w:r>
-              <w:rPr>
-                <w:rFonts w:ascii="TH Sarabun New" w:hAnsi="TH Sarabun New" w:cs="TH Sarabun New"/>
-                <w:b w:val="0"/>
-                <w:sz w:val="24"/>
-              </w:rPr>
-              <w:t xml:space="preserve"> </w:t>
-            </w:r>
-          </w:p>
+          <w:p/>
         </w:tc>
         <w:tc>
           <w:tcPr>
-            <w:tcW w:type="dxa" w:w="1361"/>
+            <w:tcW w:type="dxa" w:w="1644"/>
           </w:tcPr>
-          <w:p>
-            <w:pPr>
-              <w:spacing w:after="0" w:before="0" w:line="240" w:lineRule="auto"/>
-              <w:jc w:val="left"/>
-            </w:pPr>
-            <w:r/>
-            <w:r>
-              <w:rPr>
-                <w:rFonts w:ascii="TH Sarabun New" w:hAnsi="TH Sarabun New" w:cs="TH Sarabun New"/>
-                <w:b w:val="0"/>
-                <w:sz w:val="24"/>
-              </w:rPr>
-              <w:t xml:space="preserve"> </w:t>
-            </w:r>
-          </w:p>
-          <w:p>
-            <w:pPr>
-              <w:spacing w:after="0" w:before="0" w:line="240" w:lineRule="auto"/>
-              <w:jc w:val="left"/>
-            </w:pPr>
-            <w:r>
-              <w:rPr>
-                <w:rFonts w:ascii="TH Sarabun New" w:hAnsi="TH Sarabun New" w:cs="TH Sarabun New"/>
-                <w:b w:val="0"/>
-                <w:sz w:val="24"/>
-              </w:rPr>
-              <w:t xml:space="preserve"> </w:t>
-            </w:r>
-          </w:p>
-        </w:tc>
-      </w:tr>
-      <w:tr>
-        <w:trPr>
-          <w:trHeight w:val="520" w:hRule="atLeast"/>
-        </w:trPr>
-        <w:tc>
-          <w:tcPr>
-            <w:tcW w:type="dxa" w:w="1474"/>
-          </w:tcPr>
-          <w:p>
-            <w:pPr>
-              <w:spacing w:after="0" w:before="0" w:line="240" w:lineRule="auto"/>
-              <w:jc w:val="left"/>
-            </w:pPr>
-            <w:r/>
-            <w:r>
-              <w:rPr>
-                <w:rFonts w:ascii="TH Sarabun New" w:hAnsi="TH Sarabun New" w:cs="TH Sarabun New"/>
-                <w:b w:val="0"/>
-                <w:sz w:val="24"/>
-              </w:rPr>
-              <w:t xml:space="preserve"> </w:t>
-            </w:r>
-          </w:p>
-          <w:p>
-            <w:pPr>
-              <w:spacing w:after="0" w:before="0" w:line="240" w:lineRule="auto"/>
-              <w:jc w:val="left"/>
-            </w:pPr>
-            <w:r>
-              <w:rPr>
-                <w:rFonts w:ascii="TH Sarabun New" w:hAnsi="TH Sarabun New" w:cs="TH Sarabun New"/>
-                <w:b w:val="0"/>
-                <w:sz w:val="24"/>
-              </w:rPr>
-              <w:t xml:space="preserve"> </w:t>
-            </w:r>
-          </w:p>
-        </w:tc>
-        <w:tc>
-          <w:tcPr>
-            <w:tcW w:type="dxa" w:w="2211"/>
-          </w:tcPr>
-          <w:p>
-            <w:pPr>
-              <w:spacing w:after="0" w:before="0" w:line="240" w:lineRule="auto"/>
-              <w:jc w:val="left"/>
-            </w:pPr>
-            <w:r/>
-            <w:r>
-              <w:rPr>
-                <w:rFonts w:ascii="TH Sarabun New" w:hAnsi="TH Sarabun New" w:cs="TH Sarabun New"/>
-                <w:b w:val="0"/>
-                <w:sz w:val="24"/>
-              </w:rPr>
-              <w:t xml:space="preserve"> </w:t>
-            </w:r>
-          </w:p>
-          <w:p>
-            <w:pPr>
-              <w:spacing w:after="0" w:before="0" w:line="240" w:lineRule="auto"/>
-              <w:jc w:val="left"/>
-            </w:pPr>
-            <w:r>
-              <w:rPr>
-                <w:rFonts w:ascii="TH Sarabun New" w:hAnsi="TH Sarabun New" w:cs="TH Sarabun New"/>
-                <w:b w:val="0"/>
-                <w:sz w:val="24"/>
-              </w:rPr>
-              <w:t xml:space="preserve"> </w:t>
-            </w:r>
-          </w:p>
-        </w:tc>
-        <w:tc>
-          <w:tcPr>
-            <w:tcW w:type="dxa" w:w="624"/>
-          </w:tcPr>
-          <w:p>
-            <w:pPr>
-              <w:spacing w:after="0" w:before="0" w:line="240" w:lineRule="auto"/>
-              <w:jc w:val="left"/>
-            </w:pPr>
-            <w:r/>
-            <w:r>
-              <w:rPr>
-                <w:rFonts w:ascii="TH Sarabun New" w:hAnsi="TH Sarabun New" w:cs="TH Sarabun New"/>
-                <w:b w:val="0"/>
-                <w:sz w:val="24"/>
-              </w:rPr>
-              <w:t xml:space="preserve"> </w:t>
-            </w:r>
-          </w:p>
-          <w:p>
-            <w:pPr>
-              <w:spacing w:after="0" w:before="0" w:line="240" w:lineRule="auto"/>
-              <w:jc w:val="left"/>
-            </w:pPr>
-            <w:r>
-              <w:rPr>
-                <w:rFonts w:ascii="TH Sarabun New" w:hAnsi="TH Sarabun New" w:cs="TH Sarabun New"/>
-                <w:b w:val="0"/>
-                <w:sz w:val="24"/>
-              </w:rPr>
-              <w:t xml:space="preserve"> </w:t>
-            </w:r>
-          </w:p>
-        </w:tc>
-        <w:tc>
-          <w:tcPr>
-            <w:tcW w:type="dxa" w:w="794"/>
-          </w:tcPr>
-          <w:p>
-            <w:pPr>
-              <w:spacing w:after="0" w:before="0" w:line="240" w:lineRule="auto"/>
-              <w:jc w:val="left"/>
-            </w:pPr>
-            <w:r/>
-            <w:r>
-              <w:rPr>
-                <w:rFonts w:ascii="TH Sarabun New" w:hAnsi="TH Sarabun New" w:cs="TH Sarabun New"/>
-                <w:b w:val="0"/>
-                <w:sz w:val="24"/>
-              </w:rPr>
-              <w:t xml:space="preserve"> </w:t>
-            </w:r>
-          </w:p>
-          <w:p>
-            <w:pPr>
-              <w:spacing w:after="0" w:before="0" w:line="240" w:lineRule="auto"/>
-              <w:jc w:val="left"/>
-            </w:pPr>
-            <w:r>
-              <w:rPr>
-                <w:rFonts w:ascii="TH Sarabun New" w:hAnsi="TH Sarabun New" w:cs="TH Sarabun New"/>
-                <w:b w:val="0"/>
-                <w:sz w:val="24"/>
-              </w:rPr>
-              <w:t xml:space="preserve"> </w:t>
-            </w:r>
-          </w:p>
-        </w:tc>
-        <w:tc>
-          <w:tcPr>
-            <w:tcW w:type="dxa" w:w="2438"/>
-          </w:tcPr>
-          <w:p>
-            <w:pPr>
-              <w:spacing w:after="0" w:before="0" w:line="240" w:lineRule="auto"/>
-              <w:jc w:val="left"/>
-            </w:pPr>
-            <w:r/>
-            <w:r>
-              <w:rPr>
-                <w:rFonts w:ascii="TH Sarabun New" w:hAnsi="TH Sarabun New" w:cs="TH Sarabun New"/>
-                <w:b w:val="0"/>
-                <w:sz w:val="24"/>
-              </w:rPr>
-              <w:t xml:space="preserve"> </w:t>
-            </w:r>
-          </w:p>
-          <w:p>
-            <w:pPr>
-              <w:spacing w:after="0" w:before="0" w:line="240" w:lineRule="auto"/>
-              <w:jc w:val="left"/>
-            </w:pPr>
-            <w:r>
-              <w:rPr>
-                <w:rFonts w:ascii="TH Sarabun New" w:hAnsi="TH Sarabun New" w:cs="TH Sarabun New"/>
-                <w:b w:val="0"/>
-                <w:sz w:val="24"/>
-              </w:rPr>
-              <w:t xml:space="preserve"> </w:t>
-            </w:r>
-          </w:p>
-        </w:tc>
-        <w:tc>
-          <w:tcPr>
-            <w:tcW w:type="dxa" w:w="2665"/>
-          </w:tcPr>
-          <w:p>
-            <w:pPr>
-              <w:spacing w:after="0" w:before="0" w:line="240" w:lineRule="auto"/>
-              <w:jc w:val="left"/>
-            </w:pPr>
-            <w:r/>
-            <w:r>
-              <w:rPr>
-                <w:rFonts w:ascii="TH Sarabun New" w:hAnsi="TH Sarabun New" w:cs="TH Sarabun New"/>
-                <w:b w:val="0"/>
-                <w:sz w:val="24"/>
-              </w:rPr>
-              <w:t xml:space="preserve"> </w:t>
-            </w:r>
-          </w:p>
-          <w:p>
-            <w:pPr>
-              <w:spacing w:after="0" w:before="0" w:line="240" w:lineRule="auto"/>
-              <w:jc w:val="left"/>
-            </w:pPr>
-            <w:r>
-              <w:rPr>
-                <w:rFonts w:ascii="TH Sarabun New" w:hAnsi="TH Sarabun New" w:cs="TH Sarabun New"/>
-                <w:b w:val="0"/>
-                <w:sz w:val="24"/>
-              </w:rPr>
-              <w:t xml:space="preserve"> </w:t>
-            </w:r>
-          </w:p>
-        </w:tc>
-        <w:tc>
-          <w:tcPr>
-            <w:tcW w:type="dxa" w:w="1871"/>
-          </w:tcPr>
-          <w:p>
-            <w:pPr>
-              <w:spacing w:after="0" w:before="0" w:line="240" w:lineRule="auto"/>
-              <w:jc w:val="left"/>
-            </w:pPr>
-            <w:r/>
-            <w:r>
-              <w:rPr>
-                <w:rFonts w:ascii="TH Sarabun New" w:hAnsi="TH Sarabun New" w:cs="TH Sarabun New"/>
-                <w:b w:val="0"/>
-                <w:sz w:val="24"/>
-              </w:rPr>
-              <w:t xml:space="preserve"> </w:t>
-            </w:r>
-          </w:p>
-          <w:p>
-            <w:pPr>
-              <w:spacing w:after="0" w:before="0" w:line="240" w:lineRule="auto"/>
-              <w:jc w:val="left"/>
-            </w:pPr>
-            <w:r>
-              <w:rPr>
-                <w:rFonts w:ascii="TH Sarabun New" w:hAnsi="TH Sarabun New" w:cs="TH Sarabun New"/>
-                <w:b w:val="0"/>
-                <w:sz w:val="24"/>
-              </w:rPr>
-              <w:t xml:space="preserve"> </w:t>
-            </w:r>
-          </w:p>
-        </w:tc>
-        <w:tc>
-          <w:tcPr>
-            <w:tcW w:type="dxa" w:w="1701"/>
-          </w:tcPr>
-          <w:p>
-            <w:pPr>
-              <w:spacing w:after="0" w:before="0" w:line="240" w:lineRule="auto"/>
-              <w:jc w:val="left"/>
-            </w:pPr>
-            <w:r/>
-            <w:r>
-              <w:rPr>
-                <w:rFonts w:ascii="TH Sarabun New" w:hAnsi="TH Sarabun New" w:cs="TH Sarabun New"/>
-                <w:b w:val="0"/>
-                <w:sz w:val="24"/>
-              </w:rPr>
-              <w:t xml:space="preserve"> </w:t>
-            </w:r>
-          </w:p>
-          <w:p>
-            <w:pPr>
-              <w:spacing w:after="0" w:before="0" w:line="240" w:lineRule="auto"/>
-              <w:jc w:val="left"/>
-            </w:pPr>
-            <w:r>
-              <w:rPr>
-                <w:rFonts w:ascii="TH Sarabun New" w:hAnsi="TH Sarabun New" w:cs="TH Sarabun New"/>
-                <w:b w:val="0"/>
-                <w:sz w:val="24"/>
-              </w:rPr>
-              <w:t xml:space="preserve"> </w:t>
-            </w:r>
-          </w:p>
-        </w:tc>
-        <w:tc>
-          <w:tcPr>
-            <w:tcW w:type="dxa" w:w="1361"/>
-          </w:tcPr>
-          <w:p>
-            <w:pPr>
-              <w:spacing w:after="0" w:before="0" w:line="240" w:lineRule="auto"/>
-              <w:jc w:val="left"/>
-            </w:pPr>
-            <w:r/>
-            <w:r>
-              <w:rPr>
-                <w:rFonts w:ascii="TH Sarabun New" w:hAnsi="TH Sarabun New" w:cs="TH Sarabun New"/>
-                <w:b w:val="0"/>
-                <w:sz w:val="24"/>
-              </w:rPr>
-              <w:t xml:space="preserve"> </w:t>
-            </w:r>
-          </w:p>
-          <w:p>
-            <w:pPr>
-              <w:spacing w:after="0" w:before="0" w:line="240" w:lineRule="auto"/>
-              <w:jc w:val="left"/>
-            </w:pPr>
-            <w:r>
-              <w:rPr>
-                <w:rFonts w:ascii="TH Sarabun New" w:hAnsi="TH Sarabun New" w:cs="TH Sarabun New"/>
-                <w:b w:val="0"/>
-                <w:sz w:val="24"/>
-              </w:rPr>
-              <w:t xml:space="preserve"> </w:t>
-            </w:r>
-          </w:p>
-        </w:tc>
-      </w:tr>
-      <w:tr>
-        <w:trPr>
-          <w:trHeight w:val="520" w:hRule="atLeast"/>
-        </w:trPr>
-        <w:tc>
-          <w:tcPr>
-            <w:tcW w:type="dxa" w:w="1474"/>
-          </w:tcPr>
-          <w:p>
-            <w:pPr>
-              <w:spacing w:after="0" w:before="0" w:line="240" w:lineRule="auto"/>
-              <w:jc w:val="left"/>
-            </w:pPr>
-            <w:r/>
-            <w:r>
-              <w:rPr>
-                <w:rFonts w:ascii="TH Sarabun New" w:hAnsi="TH Sarabun New" w:cs="TH Sarabun New"/>
-                <w:b w:val="0"/>
-                <w:sz w:val="24"/>
-              </w:rPr>
-              <w:t xml:space="preserve"> </w:t>
-            </w:r>
-          </w:p>
-          <w:p>
-            <w:pPr>
-              <w:spacing w:after="0" w:before="0" w:line="240" w:lineRule="auto"/>
-              <w:jc w:val="left"/>
-            </w:pPr>
-            <w:r>
-              <w:rPr>
-                <w:rFonts w:ascii="TH Sarabun New" w:hAnsi="TH Sarabun New" w:cs="TH Sarabun New"/>
-                <w:b w:val="0"/>
-                <w:sz w:val="24"/>
-              </w:rPr>
-              <w:t xml:space="preserve"> </w:t>
-            </w:r>
-          </w:p>
-        </w:tc>
-        <w:tc>
-          <w:tcPr>
-            <w:tcW w:type="dxa" w:w="2211"/>
-          </w:tcPr>
-          <w:p>
-            <w:pPr>
-              <w:spacing w:after="0" w:before="0" w:line="240" w:lineRule="auto"/>
-              <w:jc w:val="left"/>
-            </w:pPr>
-            <w:r/>
-            <w:r>
-              <w:rPr>
-                <w:rFonts w:ascii="TH Sarabun New" w:hAnsi="TH Sarabun New" w:cs="TH Sarabun New"/>
-                <w:b w:val="0"/>
-                <w:sz w:val="24"/>
-              </w:rPr>
-              <w:t xml:space="preserve"> </w:t>
-            </w:r>
-          </w:p>
-          <w:p>
-            <w:pPr>
-              <w:spacing w:after="0" w:before="0" w:line="240" w:lineRule="auto"/>
-              <w:jc w:val="left"/>
-            </w:pPr>
-            <w:r>
-              <w:rPr>
-                <w:rFonts w:ascii="TH Sarabun New" w:hAnsi="TH Sarabun New" w:cs="TH Sarabun New"/>
-                <w:b w:val="0"/>
-                <w:sz w:val="24"/>
-              </w:rPr>
-              <w:t xml:space="preserve"> </w:t>
-            </w:r>
-          </w:p>
-        </w:tc>
-        <w:tc>
-          <w:tcPr>
-            <w:tcW w:type="dxa" w:w="624"/>
-          </w:tcPr>
-          <w:p>
-            <w:pPr>
-              <w:spacing w:after="0" w:before="0" w:line="240" w:lineRule="auto"/>
-              <w:jc w:val="left"/>
-            </w:pPr>
-            <w:r/>
-            <w:r>
-              <w:rPr>
-                <w:rFonts w:ascii="TH Sarabun New" w:hAnsi="TH Sarabun New" w:cs="TH Sarabun New"/>
-                <w:b w:val="0"/>
-                <w:sz w:val="24"/>
-              </w:rPr>
-              <w:t xml:space="preserve"> </w:t>
-            </w:r>
-          </w:p>
-          <w:p>
-            <w:pPr>
-              <w:spacing w:after="0" w:before="0" w:line="240" w:lineRule="auto"/>
-              <w:jc w:val="left"/>
-            </w:pPr>
-            <w:r>
-              <w:rPr>
-                <w:rFonts w:ascii="TH Sarabun New" w:hAnsi="TH Sarabun New" w:cs="TH Sarabun New"/>
-                <w:b w:val="0"/>
-                <w:sz w:val="24"/>
-              </w:rPr>
-              <w:t xml:space="preserve"> </w:t>
-            </w:r>
-          </w:p>
-        </w:tc>
-        <w:tc>
-          <w:tcPr>
-            <w:tcW w:type="dxa" w:w="794"/>
-          </w:tcPr>
-          <w:p>
-            <w:pPr>
-              <w:spacing w:after="0" w:before="0" w:line="240" w:lineRule="auto"/>
-              <w:jc w:val="left"/>
-            </w:pPr>
-            <w:r/>
-            <w:r>
-              <w:rPr>
-                <w:rFonts w:ascii="TH Sarabun New" w:hAnsi="TH Sarabun New" w:cs="TH Sarabun New"/>
-                <w:b w:val="0"/>
-                <w:sz w:val="24"/>
-              </w:rPr>
-              <w:t xml:space="preserve"> </w:t>
-            </w:r>
-          </w:p>
-          <w:p>
-            <w:pPr>
-              <w:spacing w:after="0" w:before="0" w:line="240" w:lineRule="auto"/>
-              <w:jc w:val="left"/>
-            </w:pPr>
-            <w:r>
-              <w:rPr>
-                <w:rFonts w:ascii="TH Sarabun New" w:hAnsi="TH Sarabun New" w:cs="TH Sarabun New"/>
-                <w:b w:val="0"/>
-                <w:sz w:val="24"/>
-              </w:rPr>
-              <w:t xml:space="preserve"> </w:t>
-            </w:r>
-          </w:p>
-        </w:tc>
-        <w:tc>
-          <w:tcPr>
-            <w:tcW w:type="dxa" w:w="2438"/>
-          </w:tcPr>
-          <w:p>
-            <w:pPr>
-              <w:spacing w:after="0" w:before="0" w:line="240" w:lineRule="auto"/>
-              <w:jc w:val="left"/>
-            </w:pPr>
-            <w:r/>
-            <w:r>
-              <w:rPr>
-                <w:rFonts w:ascii="TH Sarabun New" w:hAnsi="TH Sarabun New" w:cs="TH Sarabun New"/>
-                <w:b w:val="0"/>
-                <w:sz w:val="24"/>
-              </w:rPr>
-              <w:t xml:space="preserve"> </w:t>
-            </w:r>
-          </w:p>
-          <w:p>
-            <w:pPr>
-              <w:spacing w:after="0" w:before="0" w:line="240" w:lineRule="auto"/>
-              <w:jc w:val="left"/>
-            </w:pPr>
-            <w:r>
-              <w:rPr>
-                <w:rFonts w:ascii="TH Sarabun New" w:hAnsi="TH Sarabun New" w:cs="TH Sarabun New"/>
-                <w:b w:val="0"/>
-                <w:sz w:val="24"/>
-              </w:rPr>
-              <w:t xml:space="preserve"> </w:t>
-            </w:r>
-          </w:p>
-        </w:tc>
-        <w:tc>
-          <w:tcPr>
-            <w:tcW w:type="dxa" w:w="2665"/>
-          </w:tcPr>
-          <w:p>
-            <w:pPr>
-              <w:spacing w:after="0" w:before="0" w:line="240" w:lineRule="auto"/>
-              <w:jc w:val="left"/>
-            </w:pPr>
-            <w:r/>
-            <w:r>
-              <w:rPr>
-                <w:rFonts w:ascii="TH Sarabun New" w:hAnsi="TH Sarabun New" w:cs="TH Sarabun New"/>
-                <w:b w:val="0"/>
-                <w:sz w:val="24"/>
-              </w:rPr>
-              <w:t xml:space="preserve"> </w:t>
-            </w:r>
-          </w:p>
-          <w:p>
-            <w:pPr>
-              <w:spacing w:after="0" w:before="0" w:line="240" w:lineRule="auto"/>
-              <w:jc w:val="left"/>
-            </w:pPr>
-            <w:r>
-              <w:rPr>
-                <w:rFonts w:ascii="TH Sarabun New" w:hAnsi="TH Sarabun New" w:cs="TH Sarabun New"/>
-                <w:b w:val="0"/>
-                <w:sz w:val="24"/>
-              </w:rPr>
-              <w:t xml:space="preserve"> </w:t>
-            </w:r>
-          </w:p>
-        </w:tc>
-        <w:tc>
-          <w:tcPr>
-            <w:tcW w:type="dxa" w:w="1871"/>
-          </w:tcPr>
-          <w:p>
-            <w:pPr>
-              <w:spacing w:after="0" w:before="0" w:line="240" w:lineRule="auto"/>
-              <w:jc w:val="left"/>
-            </w:pPr>
-            <w:r/>
-            <w:r>
-              <w:rPr>
-                <w:rFonts w:ascii="TH Sarabun New" w:hAnsi="TH Sarabun New" w:cs="TH Sarabun New"/>
-                <w:b w:val="0"/>
-                <w:sz w:val="24"/>
-              </w:rPr>
-              <w:t xml:space="preserve"> </w:t>
-            </w:r>
-          </w:p>
-          <w:p>
-            <w:pPr>
-              <w:spacing w:after="0" w:before="0" w:line="240" w:lineRule="auto"/>
-              <w:jc w:val="left"/>
-            </w:pPr>
-            <w:r>
-              <w:rPr>
-                <w:rFonts w:ascii="TH Sarabun New" w:hAnsi="TH Sarabun New" w:cs="TH Sarabun New"/>
-                <w:b w:val="0"/>
-                <w:sz w:val="24"/>
-              </w:rPr>
-              <w:t xml:space="preserve"> </w:t>
-            </w:r>
-          </w:p>
-        </w:tc>
-        <w:tc>
-          <w:tcPr>
-            <w:tcW w:type="dxa" w:w="1701"/>
-          </w:tcPr>
-          <w:p>
-            <w:pPr>
-              <w:spacing w:after="0" w:before="0" w:line="240" w:lineRule="auto"/>
-              <w:jc w:val="left"/>
-            </w:pPr>
-            <w:r/>
-            <w:r>
-              <w:rPr>
-                <w:rFonts w:ascii="TH Sarabun New" w:hAnsi="TH Sarabun New" w:cs="TH Sarabun New"/>
-                <w:b w:val="0"/>
-                <w:sz w:val="24"/>
-              </w:rPr>
-              <w:t xml:space="preserve"> </w:t>
-            </w:r>
-          </w:p>
-          <w:p>
-            <w:pPr>
-              <w:spacing w:after="0" w:before="0" w:line="240" w:lineRule="auto"/>
-              <w:jc w:val="left"/>
-            </w:pPr>
-            <w:r>
-              <w:rPr>
-                <w:rFonts w:ascii="TH Sarabun New" w:hAnsi="TH Sarabun New" w:cs="TH Sarabun New"/>
-                <w:b w:val="0"/>
-                <w:sz w:val="24"/>
-              </w:rPr>
-              <w:t xml:space="preserve"> </w:t>
-            </w:r>
-          </w:p>
-        </w:tc>
-        <w:tc>
-          <w:tcPr>
-            <w:tcW w:type="dxa" w:w="1361"/>
-          </w:tcPr>
-          <w:p>
-            <w:pPr>
-              <w:spacing w:after="0" w:before="0" w:line="240" w:lineRule="auto"/>
-              <w:jc w:val="left"/>
-            </w:pPr>
-            <w:r/>
-            <w:r>
-              <w:rPr>
-                <w:rFonts w:ascii="TH Sarabun New" w:hAnsi="TH Sarabun New" w:cs="TH Sarabun New"/>
-                <w:b w:val="0"/>
-                <w:sz w:val="24"/>
-              </w:rPr>
-              <w:t xml:space="preserve"> </w:t>
-            </w:r>
-          </w:p>
-          <w:p>
-            <w:pPr>
-              <w:spacing w:after="0" w:before="0" w:line="240" w:lineRule="auto"/>
-              <w:jc w:val="left"/>
-            </w:pPr>
-            <w:r>
-              <w:rPr>
-                <w:rFonts w:ascii="TH Sarabun New" w:hAnsi="TH Sarabun New" w:cs="TH Sarabun New"/>
-                <w:b w:val="0"/>
-                <w:sz w:val="24"/>
-              </w:rPr>
-              <w:t xml:space="preserve"> </w:t>
-            </w:r>
-          </w:p>
-        </w:tc>
-      </w:tr>
-      <w:tr>
-        <w:trPr>
-          <w:trHeight w:val="520" w:hRule="atLeast"/>
-        </w:trPr>
-        <w:tc>
-          <w:tcPr>
-            <w:tcW w:type="dxa" w:w="1474"/>
-          </w:tcPr>
-          <w:p>
-            <w:pPr>
-              <w:spacing w:after="0" w:before="0" w:line="240" w:lineRule="auto"/>
-              <w:jc w:val="left"/>
-            </w:pPr>
-            <w:r/>
-            <w:r>
-              <w:rPr>
-                <w:rFonts w:ascii="TH Sarabun New" w:hAnsi="TH Sarabun New" w:cs="TH Sarabun New"/>
-                <w:b w:val="0"/>
-                <w:sz w:val="24"/>
-              </w:rPr>
-              <w:t xml:space="preserve"> </w:t>
-            </w:r>
-          </w:p>
-          <w:p>
-            <w:pPr>
-              <w:spacing w:after="0" w:before="0" w:line="240" w:lineRule="auto"/>
-              <w:jc w:val="left"/>
-            </w:pPr>
-            <w:r>
-              <w:rPr>
-                <w:rFonts w:ascii="TH Sarabun New" w:hAnsi="TH Sarabun New" w:cs="TH Sarabun New"/>
-                <w:b w:val="0"/>
-                <w:sz w:val="24"/>
-              </w:rPr>
-              <w:t xml:space="preserve"> </w:t>
-            </w:r>
-          </w:p>
-        </w:tc>
-        <w:tc>
-          <w:tcPr>
-            <w:tcW w:type="dxa" w:w="2211"/>
-          </w:tcPr>
-          <w:p>
-            <w:pPr>
-              <w:spacing w:after="0" w:before="0" w:line="240" w:lineRule="auto"/>
-              <w:jc w:val="left"/>
-            </w:pPr>
-            <w:r/>
-            <w:r>
-              <w:rPr>
-                <w:rFonts w:ascii="TH Sarabun New" w:hAnsi="TH Sarabun New" w:cs="TH Sarabun New"/>
-                <w:b w:val="0"/>
-                <w:sz w:val="24"/>
-              </w:rPr>
-              <w:t xml:space="preserve"> </w:t>
-            </w:r>
-          </w:p>
-          <w:p>
-            <w:pPr>
-              <w:spacing w:after="0" w:before="0" w:line="240" w:lineRule="auto"/>
-              <w:jc w:val="left"/>
-            </w:pPr>
-            <w:r>
-              <w:rPr>
-                <w:rFonts w:ascii="TH Sarabun New" w:hAnsi="TH Sarabun New" w:cs="TH Sarabun New"/>
-                <w:b w:val="0"/>
-                <w:sz w:val="24"/>
-              </w:rPr>
-              <w:t xml:space="preserve"> </w:t>
-            </w:r>
-          </w:p>
-        </w:tc>
-        <w:tc>
-          <w:tcPr>
-            <w:tcW w:type="dxa" w:w="624"/>
-          </w:tcPr>
-          <w:p>
-            <w:pPr>
-              <w:spacing w:after="0" w:before="0" w:line="240" w:lineRule="auto"/>
-              <w:jc w:val="left"/>
-            </w:pPr>
-            <w:r/>
-            <w:r>
-              <w:rPr>
-                <w:rFonts w:ascii="TH Sarabun New" w:hAnsi="TH Sarabun New" w:cs="TH Sarabun New"/>
-                <w:b w:val="0"/>
-                <w:sz w:val="24"/>
-              </w:rPr>
-              <w:t xml:space="preserve"> </w:t>
-            </w:r>
-          </w:p>
-          <w:p>
-            <w:pPr>
-              <w:spacing w:after="0" w:before="0" w:line="240" w:lineRule="auto"/>
-              <w:jc w:val="left"/>
-            </w:pPr>
-            <w:r>
-              <w:rPr>
-                <w:rFonts w:ascii="TH Sarabun New" w:hAnsi="TH Sarabun New" w:cs="TH Sarabun New"/>
-                <w:b w:val="0"/>
-                <w:sz w:val="24"/>
-              </w:rPr>
-              <w:t xml:space="preserve"> </w:t>
-            </w:r>
-          </w:p>
-        </w:tc>
-        <w:tc>
-          <w:tcPr>
-            <w:tcW w:type="dxa" w:w="794"/>
-          </w:tcPr>
-          <w:p>
-            <w:pPr>
-              <w:spacing w:after="0" w:before="0" w:line="240" w:lineRule="auto"/>
-              <w:jc w:val="left"/>
-            </w:pPr>
-            <w:r/>
-            <w:r>
-              <w:rPr>
-                <w:rFonts w:ascii="TH Sarabun New" w:hAnsi="TH Sarabun New" w:cs="TH Sarabun New"/>
-                <w:b w:val="0"/>
-                <w:sz w:val="24"/>
-              </w:rPr>
-              <w:t xml:space="preserve"> </w:t>
-            </w:r>
-          </w:p>
-          <w:p>
-            <w:pPr>
-              <w:spacing w:after="0" w:before="0" w:line="240" w:lineRule="auto"/>
-              <w:jc w:val="left"/>
-            </w:pPr>
-            <w:r>
-              <w:rPr>
-                <w:rFonts w:ascii="TH Sarabun New" w:hAnsi="TH Sarabun New" w:cs="TH Sarabun New"/>
-                <w:b w:val="0"/>
-                <w:sz w:val="24"/>
-              </w:rPr>
-              <w:t xml:space="preserve"> </w:t>
-            </w:r>
-          </w:p>
-        </w:tc>
-        <w:tc>
-          <w:tcPr>
-            <w:tcW w:type="dxa" w:w="2438"/>
-          </w:tcPr>
-          <w:p>
-            <w:pPr>
-              <w:spacing w:after="0" w:before="0" w:line="240" w:lineRule="auto"/>
-              <w:jc w:val="left"/>
-            </w:pPr>
-            <w:r/>
-            <w:r>
-              <w:rPr>
-                <w:rFonts w:ascii="TH Sarabun New" w:hAnsi="TH Sarabun New" w:cs="TH Sarabun New"/>
-                <w:b w:val="0"/>
-                <w:sz w:val="24"/>
-              </w:rPr>
-              <w:t xml:space="preserve"> </w:t>
-            </w:r>
-          </w:p>
-          <w:p>
-            <w:pPr>
-              <w:spacing w:after="0" w:before="0" w:line="240" w:lineRule="auto"/>
-              <w:jc w:val="left"/>
-            </w:pPr>
-            <w:r>
-              <w:rPr>
-                <w:rFonts w:ascii="TH Sarabun New" w:hAnsi="TH Sarabun New" w:cs="TH Sarabun New"/>
-                <w:b w:val="0"/>
-                <w:sz w:val="24"/>
-              </w:rPr>
-              <w:t xml:space="preserve"> </w:t>
-            </w:r>
-          </w:p>
-        </w:tc>
-        <w:tc>
-          <w:tcPr>
-            <w:tcW w:type="dxa" w:w="2665"/>
-          </w:tcPr>
-          <w:p>
-            <w:pPr>
-              <w:spacing w:after="0" w:before="0" w:line="240" w:lineRule="auto"/>
-              <w:jc w:val="left"/>
-            </w:pPr>
-            <w:r/>
-            <w:r>
-              <w:rPr>
-                <w:rFonts w:ascii="TH Sarabun New" w:hAnsi="TH Sarabun New" w:cs="TH Sarabun New"/>
-                <w:b w:val="0"/>
-                <w:sz w:val="24"/>
-              </w:rPr>
-              <w:t xml:space="preserve"> </w:t>
-            </w:r>
-          </w:p>
-          <w:p>
-            <w:pPr>
-              <w:spacing w:after="0" w:before="0" w:line="240" w:lineRule="auto"/>
-              <w:jc w:val="left"/>
-            </w:pPr>
-            <w:r>
-              <w:rPr>
-                <w:rFonts w:ascii="TH Sarabun New" w:hAnsi="TH Sarabun New" w:cs="TH Sarabun New"/>
-                <w:b w:val="0"/>
-                <w:sz w:val="24"/>
-              </w:rPr>
-              <w:t xml:space="preserve"> </w:t>
-            </w:r>
-          </w:p>
-        </w:tc>
-        <w:tc>
-          <w:tcPr>
-            <w:tcW w:type="dxa" w:w="1871"/>
-          </w:tcPr>
-          <w:p>
-            <w:pPr>
-              <w:spacing w:after="0" w:before="0" w:line="240" w:lineRule="auto"/>
-              <w:jc w:val="left"/>
-            </w:pPr>
-            <w:r/>
-            <w:r>
-              <w:rPr>
-                <w:rFonts w:ascii="TH Sarabun New" w:hAnsi="TH Sarabun New" w:cs="TH Sarabun New"/>
-                <w:b w:val="0"/>
-                <w:sz w:val="24"/>
-              </w:rPr>
-              <w:t xml:space="preserve"> </w:t>
-            </w:r>
-          </w:p>
-          <w:p>
-            <w:pPr>
-              <w:spacing w:after="0" w:before="0" w:line="240" w:lineRule="auto"/>
-              <w:jc w:val="left"/>
-            </w:pPr>
-            <w:r>
-              <w:rPr>
-                <w:rFonts w:ascii="TH Sarabun New" w:hAnsi="TH Sarabun New" w:cs="TH Sarabun New"/>
-                <w:b w:val="0"/>
-                <w:sz w:val="24"/>
-              </w:rPr>
-              <w:t xml:space="preserve"> </w:t>
-            </w:r>
-          </w:p>
-        </w:tc>
-        <w:tc>
-          <w:tcPr>
-            <w:tcW w:type="dxa" w:w="1701"/>
-          </w:tcPr>
-          <w:p>
-            <w:pPr>
-              <w:spacing w:after="0" w:before="0" w:line="240" w:lineRule="auto"/>
-              <w:jc w:val="left"/>
-            </w:pPr>
-            <w:r/>
-            <w:r>
-              <w:rPr>
-                <w:rFonts w:ascii="TH Sarabun New" w:hAnsi="TH Sarabun New" w:cs="TH Sarabun New"/>
-                <w:b w:val="0"/>
-                <w:sz w:val="24"/>
-              </w:rPr>
-              <w:t xml:space="preserve"> </w:t>
-            </w:r>
-          </w:p>
-          <w:p>
-            <w:pPr>
-              <w:spacing w:after="0" w:before="0" w:line="240" w:lineRule="auto"/>
-              <w:jc w:val="left"/>
-            </w:pPr>
-            <w:r>
-              <w:rPr>
-                <w:rFonts w:ascii="TH Sarabun New" w:hAnsi="TH Sarabun New" w:cs="TH Sarabun New"/>
-                <w:b w:val="0"/>
-                <w:sz w:val="24"/>
-              </w:rPr>
-              <w:t xml:space="preserve"> </w:t>
-            </w:r>
-          </w:p>
-        </w:tc>
-        <w:tc>
-          <w:tcPr>
-            <w:tcW w:type="dxa" w:w="1361"/>
-          </w:tcPr>
-          <w:p>
-            <w:pPr>
-              <w:spacing w:after="0" w:before="0" w:line="240" w:lineRule="auto"/>
-              <w:jc w:val="left"/>
-            </w:pPr>
-            <w:r/>
-            <w:r>
-              <w:rPr>
-                <w:rFonts w:ascii="TH Sarabun New" w:hAnsi="TH Sarabun New" w:cs="TH Sarabun New"/>
-                <w:b w:val="0"/>
-                <w:sz w:val="24"/>
-              </w:rPr>
-              <w:t xml:space="preserve"> </w:t>
-            </w:r>
-          </w:p>
-          <w:p>
-            <w:pPr>
-              <w:spacing w:after="0" w:before="0" w:line="240" w:lineRule="auto"/>
-              <w:jc w:val="left"/>
-            </w:pPr>
-            <w:r>
-              <w:rPr>
-                <w:rFonts w:ascii="TH Sarabun New" w:hAnsi="TH Sarabun New" w:cs="TH Sarabun New"/>
-                <w:b w:val="0"/>
-                <w:sz w:val="24"/>
-              </w:rPr>
-              <w:t xml:space="preserve"> </w:t>
-            </w:r>
-          </w:p>
-        </w:tc>
-      </w:tr>
-      <w:tr>
-        <w:trPr>
-          <w:trHeight w:val="520" w:hRule="atLeast"/>
-        </w:trPr>
-        <w:tc>
-          <w:tcPr>
-            <w:tcW w:type="dxa" w:w="1474"/>
-          </w:tcPr>
-          <w:p>
-            <w:pPr>
-              <w:spacing w:after="0" w:before="0" w:line="240" w:lineRule="auto"/>
-              <w:jc w:val="left"/>
-            </w:pPr>
-            <w:r/>
-            <w:r>
-              <w:rPr>
-                <w:rFonts w:ascii="TH Sarabun New" w:hAnsi="TH Sarabun New" w:cs="TH Sarabun New"/>
-                <w:b w:val="0"/>
-                <w:sz w:val="24"/>
-              </w:rPr>
-              <w:t xml:space="preserve"> </w:t>
-            </w:r>
-          </w:p>
-          <w:p>
-            <w:pPr>
-              <w:spacing w:after="0" w:before="0" w:line="240" w:lineRule="auto"/>
-              <w:jc w:val="left"/>
-            </w:pPr>
-            <w:r>
-              <w:rPr>
-                <w:rFonts w:ascii="TH Sarabun New" w:hAnsi="TH Sarabun New" w:cs="TH Sarabun New"/>
-                <w:b w:val="0"/>
-                <w:sz w:val="24"/>
-              </w:rPr>
-              <w:t xml:space="preserve"> </w:t>
-            </w:r>
-          </w:p>
-        </w:tc>
-        <w:tc>
-          <w:tcPr>
-            <w:tcW w:type="dxa" w:w="2211"/>
-          </w:tcPr>
-          <w:p>
-            <w:pPr>
-              <w:spacing w:after="0" w:before="0" w:line="240" w:lineRule="auto"/>
-              <w:jc w:val="left"/>
-            </w:pPr>
-            <w:r/>
-            <w:r>
-              <w:rPr>
-                <w:rFonts w:ascii="TH Sarabun New" w:hAnsi="TH Sarabun New" w:cs="TH Sarabun New"/>
-                <w:b w:val="0"/>
-                <w:sz w:val="24"/>
-              </w:rPr>
-              <w:t xml:space="preserve"> </w:t>
-            </w:r>
-          </w:p>
-          <w:p>
-            <w:pPr>
-              <w:spacing w:after="0" w:before="0" w:line="240" w:lineRule="auto"/>
-              <w:jc w:val="left"/>
-            </w:pPr>
-            <w:r>
-              <w:rPr>
-                <w:rFonts w:ascii="TH Sarabun New" w:hAnsi="TH Sarabun New" w:cs="TH Sarabun New"/>
-                <w:b w:val="0"/>
-                <w:sz w:val="24"/>
-              </w:rPr>
-              <w:t xml:space="preserve"> </w:t>
-            </w:r>
-          </w:p>
-        </w:tc>
-        <w:tc>
-          <w:tcPr>
-            <w:tcW w:type="dxa" w:w="624"/>
-          </w:tcPr>
-          <w:p>
-            <w:pPr>
-              <w:spacing w:after="0" w:before="0" w:line="240" w:lineRule="auto"/>
-              <w:jc w:val="left"/>
-            </w:pPr>
-            <w:r/>
-            <w:r>
-              <w:rPr>
-                <w:rFonts w:ascii="TH Sarabun New" w:hAnsi="TH Sarabun New" w:cs="TH Sarabun New"/>
-                <w:b w:val="0"/>
-                <w:sz w:val="24"/>
-              </w:rPr>
-              <w:t xml:space="preserve"> </w:t>
-            </w:r>
-          </w:p>
-          <w:p>
-            <w:pPr>
-              <w:spacing w:after="0" w:before="0" w:line="240" w:lineRule="auto"/>
-              <w:jc w:val="left"/>
-            </w:pPr>
-            <w:r>
-              <w:rPr>
-                <w:rFonts w:ascii="TH Sarabun New" w:hAnsi="TH Sarabun New" w:cs="TH Sarabun New"/>
-                <w:b w:val="0"/>
-                <w:sz w:val="24"/>
-              </w:rPr>
-              <w:t xml:space="preserve"> </w:t>
-            </w:r>
-          </w:p>
-        </w:tc>
-        <w:tc>
-          <w:tcPr>
-            <w:tcW w:type="dxa" w:w="794"/>
-          </w:tcPr>
-          <w:p>
-            <w:pPr>
-              <w:spacing w:after="0" w:before="0" w:line="240" w:lineRule="auto"/>
-              <w:jc w:val="left"/>
-            </w:pPr>
-            <w:r/>
-            <w:r>
-              <w:rPr>
-                <w:rFonts w:ascii="TH Sarabun New" w:hAnsi="TH Sarabun New" w:cs="TH Sarabun New"/>
-                <w:b w:val="0"/>
-                <w:sz w:val="24"/>
-              </w:rPr>
-              <w:t xml:space="preserve"> </w:t>
-            </w:r>
-          </w:p>
-          <w:p>
-            <w:pPr>
-              <w:spacing w:after="0" w:before="0" w:line="240" w:lineRule="auto"/>
-              <w:jc w:val="left"/>
-            </w:pPr>
-            <w:r>
-              <w:rPr>
-                <w:rFonts w:ascii="TH Sarabun New" w:hAnsi="TH Sarabun New" w:cs="TH Sarabun New"/>
-                <w:b w:val="0"/>
-                <w:sz w:val="24"/>
-              </w:rPr>
-              <w:t xml:space="preserve"> </w:t>
-            </w:r>
-          </w:p>
-        </w:tc>
-        <w:tc>
-          <w:tcPr>
-            <w:tcW w:type="dxa" w:w="2438"/>
-          </w:tcPr>
-          <w:p>
-            <w:pPr>
-              <w:spacing w:after="0" w:before="0" w:line="240" w:lineRule="auto"/>
-              <w:jc w:val="left"/>
-            </w:pPr>
-            <w:r/>
-            <w:r>
-              <w:rPr>
-                <w:rFonts w:ascii="TH Sarabun New" w:hAnsi="TH Sarabun New" w:cs="TH Sarabun New"/>
-                <w:b w:val="0"/>
-                <w:sz w:val="24"/>
-              </w:rPr>
-              <w:t xml:space="preserve"> </w:t>
-            </w:r>
-          </w:p>
-          <w:p>
-            <w:pPr>
-              <w:spacing w:after="0" w:before="0" w:line="240" w:lineRule="auto"/>
-              <w:jc w:val="left"/>
-            </w:pPr>
-            <w:r>
-              <w:rPr>
-                <w:rFonts w:ascii="TH Sarabun New" w:hAnsi="TH Sarabun New" w:cs="TH Sarabun New"/>
-                <w:b w:val="0"/>
-                <w:sz w:val="24"/>
-              </w:rPr>
-              <w:t xml:space="preserve"> </w:t>
-            </w:r>
-          </w:p>
-        </w:tc>
-        <w:tc>
-          <w:tcPr>
-            <w:tcW w:type="dxa" w:w="2665"/>
-          </w:tcPr>
-          <w:p>
-            <w:pPr>
-              <w:spacing w:after="0" w:before="0" w:line="240" w:lineRule="auto"/>
-              <w:jc w:val="left"/>
-            </w:pPr>
-            <w:r/>
-            <w:r>
-              <w:rPr>
-                <w:rFonts w:ascii="TH Sarabun New" w:hAnsi="TH Sarabun New" w:cs="TH Sarabun New"/>
-                <w:b w:val="0"/>
-                <w:sz w:val="24"/>
-              </w:rPr>
-              <w:t xml:space="preserve"> </w:t>
-            </w:r>
-          </w:p>
-          <w:p>
-            <w:pPr>
-              <w:spacing w:after="0" w:before="0" w:line="240" w:lineRule="auto"/>
-              <w:jc w:val="left"/>
-            </w:pPr>
-            <w:r>
-              <w:rPr>
-                <w:rFonts w:ascii="TH Sarabun New" w:hAnsi="TH Sarabun New" w:cs="TH Sarabun New"/>
-                <w:b w:val="0"/>
-                <w:sz w:val="24"/>
-              </w:rPr>
-              <w:t xml:space="preserve"> </w:t>
-            </w:r>
-          </w:p>
-        </w:tc>
-        <w:tc>
-          <w:tcPr>
-            <w:tcW w:type="dxa" w:w="1871"/>
-          </w:tcPr>
-          <w:p>
-            <w:pPr>
-              <w:spacing w:after="0" w:before="0" w:line="240" w:lineRule="auto"/>
-              <w:jc w:val="left"/>
-            </w:pPr>
-            <w:r/>
-            <w:r>
-              <w:rPr>
-                <w:rFonts w:ascii="TH Sarabun New" w:hAnsi="TH Sarabun New" w:cs="TH Sarabun New"/>
-                <w:b w:val="0"/>
-                <w:sz w:val="24"/>
-              </w:rPr>
-              <w:t xml:space="preserve"> </w:t>
-            </w:r>
-          </w:p>
-          <w:p>
-            <w:pPr>
-              <w:spacing w:after="0" w:before="0" w:line="240" w:lineRule="auto"/>
-              <w:jc w:val="left"/>
-            </w:pPr>
-            <w:r>
-              <w:rPr>
-                <w:rFonts w:ascii="TH Sarabun New" w:hAnsi="TH Sarabun New" w:cs="TH Sarabun New"/>
-                <w:b w:val="0"/>
-                <w:sz w:val="24"/>
-              </w:rPr>
-              <w:t xml:space="preserve"> </w:t>
-            </w:r>
-          </w:p>
-        </w:tc>
-        <w:tc>
-          <w:tcPr>
-            <w:tcW w:type="dxa" w:w="1701"/>
-          </w:tcPr>
-          <w:p>
-            <w:pPr>
-              <w:spacing w:after="0" w:before="0" w:line="240" w:lineRule="auto"/>
-              <w:jc w:val="left"/>
-            </w:pPr>
-            <w:r/>
-            <w:r>
-              <w:rPr>
-                <w:rFonts w:ascii="TH Sarabun New" w:hAnsi="TH Sarabun New" w:cs="TH Sarabun New"/>
-                <w:b w:val="0"/>
-                <w:sz w:val="24"/>
-              </w:rPr>
-              <w:t xml:space="preserve"> </w:t>
-            </w:r>
-          </w:p>
-          <w:p>
-            <w:pPr>
-              <w:spacing w:after="0" w:before="0" w:line="240" w:lineRule="auto"/>
-              <w:jc w:val="left"/>
-            </w:pPr>
-            <w:r>
-              <w:rPr>
-                <w:rFonts w:ascii="TH Sarabun New" w:hAnsi="TH Sarabun New" w:cs="TH Sarabun New"/>
-                <w:b w:val="0"/>
-                <w:sz w:val="24"/>
-              </w:rPr>
-              <w:t xml:space="preserve"> </w:t>
-            </w:r>
-          </w:p>
-        </w:tc>
-        <w:tc>
-          <w:tcPr>
-            <w:tcW w:type="dxa" w:w="1361"/>
-          </w:tcPr>
-          <w:p>
-            <w:pPr>
-              <w:spacing w:after="0" w:before="0" w:line="240" w:lineRule="auto"/>
-              <w:jc w:val="left"/>
-            </w:pPr>
-            <w:r/>
-            <w:r>
-              <w:rPr>
-                <w:rFonts w:ascii="TH Sarabun New" w:hAnsi="TH Sarabun New" w:cs="TH Sarabun New"/>
-                <w:b w:val="0"/>
-                <w:sz w:val="24"/>
-              </w:rPr>
-              <w:t xml:space="preserve"> </w:t>
-            </w:r>
-          </w:p>
-          <w:p>
-            <w:pPr>
-              <w:spacing w:after="0" w:before="0" w:line="240" w:lineRule="auto"/>
-              <w:jc w:val="left"/>
-            </w:pPr>
-            <w:r>
-              <w:rPr>
-                <w:rFonts w:ascii="TH Sarabun New" w:hAnsi="TH Sarabun New" w:cs="TH Sarabun New"/>
-                <w:b w:val="0"/>
-                <w:sz w:val="24"/>
-              </w:rPr>
-              <w:t xml:space="preserve"> </w:t>
-            </w:r>
-          </w:p>
-        </w:tc>
-      </w:tr>
-      <w:tr>
-        <w:trPr>
-          <w:trHeight w:val="520" w:hRule="atLeast"/>
-        </w:trPr>
-        <w:tc>
-          <w:tcPr>
-            <w:tcW w:type="dxa" w:w="1474"/>
-          </w:tcPr>
-          <w:p>
-            <w:pPr>
-              <w:spacing w:after="0" w:before="0" w:line="240" w:lineRule="auto"/>
-              <w:jc w:val="left"/>
-            </w:pPr>
-            <w:r/>
-            <w:r>
-              <w:rPr>
-                <w:rFonts w:ascii="TH Sarabun New" w:hAnsi="TH Sarabun New" w:cs="TH Sarabun New"/>
-                <w:b w:val="0"/>
-                <w:sz w:val="24"/>
-              </w:rPr>
-              <w:t xml:space="preserve"> </w:t>
-            </w:r>
-          </w:p>
-          <w:p>
-            <w:pPr>
-              <w:spacing w:after="0" w:before="0" w:line="240" w:lineRule="auto"/>
-              <w:jc w:val="left"/>
-            </w:pPr>
-            <w:r>
-              <w:rPr>
-                <w:rFonts w:ascii="TH Sarabun New" w:hAnsi="TH Sarabun New" w:cs="TH Sarabun New"/>
-                <w:b w:val="0"/>
-                <w:sz w:val="24"/>
-              </w:rPr>
-              <w:t xml:space="preserve"> </w:t>
-            </w:r>
-          </w:p>
-        </w:tc>
-        <w:tc>
-          <w:tcPr>
-            <w:tcW w:type="dxa" w:w="2211"/>
-          </w:tcPr>
-          <w:p>
-            <w:pPr>
-              <w:spacing w:after="0" w:before="0" w:line="240" w:lineRule="auto"/>
-              <w:jc w:val="left"/>
-            </w:pPr>
-            <w:r/>
-            <w:r>
-              <w:rPr>
-                <w:rFonts w:ascii="TH Sarabun New" w:hAnsi="TH Sarabun New" w:cs="TH Sarabun New"/>
-                <w:b w:val="0"/>
-                <w:sz w:val="24"/>
-              </w:rPr>
-              <w:t xml:space="preserve"> </w:t>
-            </w:r>
-          </w:p>
-          <w:p>
-            <w:pPr>
-              <w:spacing w:after="0" w:before="0" w:line="240" w:lineRule="auto"/>
-              <w:jc w:val="left"/>
-            </w:pPr>
-            <w:r>
-              <w:rPr>
-                <w:rFonts w:ascii="TH Sarabun New" w:hAnsi="TH Sarabun New" w:cs="TH Sarabun New"/>
-                <w:b w:val="0"/>
-                <w:sz w:val="24"/>
-              </w:rPr>
-              <w:t xml:space="preserve"> </w:t>
-            </w:r>
-          </w:p>
-        </w:tc>
-        <w:tc>
-          <w:tcPr>
-            <w:tcW w:type="dxa" w:w="624"/>
-          </w:tcPr>
-          <w:p>
-            <w:pPr>
-              <w:spacing w:after="0" w:before="0" w:line="240" w:lineRule="auto"/>
-              <w:jc w:val="left"/>
-            </w:pPr>
-            <w:r/>
-            <w:r>
-              <w:rPr>
-                <w:rFonts w:ascii="TH Sarabun New" w:hAnsi="TH Sarabun New" w:cs="TH Sarabun New"/>
-                <w:b w:val="0"/>
-                <w:sz w:val="24"/>
-              </w:rPr>
-              <w:t xml:space="preserve"> </w:t>
-            </w:r>
-          </w:p>
-          <w:p>
-            <w:pPr>
-              <w:spacing w:after="0" w:before="0" w:line="240" w:lineRule="auto"/>
-              <w:jc w:val="left"/>
-            </w:pPr>
-            <w:r>
-              <w:rPr>
-                <w:rFonts w:ascii="TH Sarabun New" w:hAnsi="TH Sarabun New" w:cs="TH Sarabun New"/>
-                <w:b w:val="0"/>
-                <w:sz w:val="24"/>
-              </w:rPr>
-              <w:t xml:space="preserve"> </w:t>
-            </w:r>
-          </w:p>
-        </w:tc>
-        <w:tc>
-          <w:tcPr>
-            <w:tcW w:type="dxa" w:w="794"/>
-          </w:tcPr>
-          <w:p>
-            <w:pPr>
-              <w:spacing w:after="0" w:before="0" w:line="240" w:lineRule="auto"/>
-              <w:jc w:val="left"/>
-            </w:pPr>
-            <w:r/>
-            <w:r>
-              <w:rPr>
-                <w:rFonts w:ascii="TH Sarabun New" w:hAnsi="TH Sarabun New" w:cs="TH Sarabun New"/>
-                <w:b w:val="0"/>
-                <w:sz w:val="24"/>
-              </w:rPr>
-              <w:t xml:space="preserve"> </w:t>
-            </w:r>
-          </w:p>
-          <w:p>
-            <w:pPr>
-              <w:spacing w:after="0" w:before="0" w:line="240" w:lineRule="auto"/>
-              <w:jc w:val="left"/>
-            </w:pPr>
-            <w:r>
-              <w:rPr>
-                <w:rFonts w:ascii="TH Sarabun New" w:hAnsi="TH Sarabun New" w:cs="TH Sarabun New"/>
-                <w:b w:val="0"/>
-                <w:sz w:val="24"/>
-              </w:rPr>
-              <w:t xml:space="preserve"> </w:t>
-            </w:r>
-          </w:p>
-        </w:tc>
-        <w:tc>
-          <w:tcPr>
-            <w:tcW w:type="dxa" w:w="2438"/>
-          </w:tcPr>
-          <w:p>
-            <w:pPr>
-              <w:spacing w:after="0" w:before="0" w:line="240" w:lineRule="auto"/>
-              <w:jc w:val="left"/>
-            </w:pPr>
-            <w:r/>
-            <w:r>
-              <w:rPr>
-                <w:rFonts w:ascii="TH Sarabun New" w:hAnsi="TH Sarabun New" w:cs="TH Sarabun New"/>
-                <w:b w:val="0"/>
-                <w:sz w:val="24"/>
-              </w:rPr>
-              <w:t xml:space="preserve"> </w:t>
-            </w:r>
-          </w:p>
-          <w:p>
-            <w:pPr>
-              <w:spacing w:after="0" w:before="0" w:line="240" w:lineRule="auto"/>
-              <w:jc w:val="left"/>
-            </w:pPr>
-            <w:r>
-              <w:rPr>
-                <w:rFonts w:ascii="TH Sarabun New" w:hAnsi="TH Sarabun New" w:cs="TH Sarabun New"/>
-                <w:b w:val="0"/>
-                <w:sz w:val="24"/>
-              </w:rPr>
-              <w:t xml:space="preserve"> </w:t>
-            </w:r>
-          </w:p>
-        </w:tc>
-        <w:tc>
-          <w:tcPr>
-            <w:tcW w:type="dxa" w:w="2665"/>
-          </w:tcPr>
-          <w:p>
-            <w:pPr>
-              <w:spacing w:after="0" w:before="0" w:line="240" w:lineRule="auto"/>
-              <w:jc w:val="left"/>
-            </w:pPr>
-            <w:r/>
-            <w:r>
-              <w:rPr>
-                <w:rFonts w:ascii="TH Sarabun New" w:hAnsi="TH Sarabun New" w:cs="TH Sarabun New"/>
-                <w:b w:val="0"/>
-                <w:sz w:val="24"/>
-              </w:rPr>
-              <w:t xml:space="preserve"> </w:t>
-            </w:r>
-          </w:p>
-          <w:p>
-            <w:pPr>
-              <w:spacing w:after="0" w:before="0" w:line="240" w:lineRule="auto"/>
-              <w:jc w:val="left"/>
-            </w:pPr>
-            <w:r>
-              <w:rPr>
-                <w:rFonts w:ascii="TH Sarabun New" w:hAnsi="TH Sarabun New" w:cs="TH Sarabun New"/>
-                <w:b w:val="0"/>
-                <w:sz w:val="24"/>
-              </w:rPr>
-              <w:t xml:space="preserve"> </w:t>
-            </w:r>
-          </w:p>
-        </w:tc>
-        <w:tc>
-          <w:tcPr>
-            <w:tcW w:type="dxa" w:w="1871"/>
-          </w:tcPr>
-          <w:p>
-            <w:pPr>
-              <w:spacing w:after="0" w:before="0" w:line="240" w:lineRule="auto"/>
-              <w:jc w:val="left"/>
-            </w:pPr>
-            <w:r/>
-            <w:r>
-              <w:rPr>
-                <w:rFonts w:ascii="TH Sarabun New" w:hAnsi="TH Sarabun New" w:cs="TH Sarabun New"/>
-                <w:b w:val="0"/>
-                <w:sz w:val="24"/>
-              </w:rPr>
-              <w:t xml:space="preserve"> </w:t>
-            </w:r>
-          </w:p>
-          <w:p>
-            <w:pPr>
-              <w:spacing w:after="0" w:before="0" w:line="240" w:lineRule="auto"/>
-              <w:jc w:val="left"/>
-            </w:pPr>
-            <w:r>
-              <w:rPr>
-                <w:rFonts w:ascii="TH Sarabun New" w:hAnsi="TH Sarabun New" w:cs="TH Sarabun New"/>
-                <w:b w:val="0"/>
-                <w:sz w:val="24"/>
-              </w:rPr>
-              <w:t xml:space="preserve"> </w:t>
-            </w:r>
-          </w:p>
-        </w:tc>
-        <w:tc>
-          <w:tcPr>
-            <w:tcW w:type="dxa" w:w="1701"/>
-          </w:tcPr>
-          <w:p>
-            <w:pPr>
-              <w:spacing w:after="0" w:before="0" w:line="240" w:lineRule="auto"/>
-              <w:jc w:val="left"/>
-            </w:pPr>
-            <w:r/>
-            <w:r>
-              <w:rPr>
-                <w:rFonts w:ascii="TH Sarabun New" w:hAnsi="TH Sarabun New" w:cs="TH Sarabun New"/>
-                <w:b w:val="0"/>
-                <w:sz w:val="24"/>
-              </w:rPr>
-              <w:t xml:space="preserve"> </w:t>
-            </w:r>
-          </w:p>
-          <w:p>
-            <w:pPr>
-              <w:spacing w:after="0" w:before="0" w:line="240" w:lineRule="auto"/>
-              <w:jc w:val="left"/>
-            </w:pPr>
-            <w:r>
-              <w:rPr>
-                <w:rFonts w:ascii="TH Sarabun New" w:hAnsi="TH Sarabun New" w:cs="TH Sarabun New"/>
-                <w:b w:val="0"/>
-                <w:sz w:val="24"/>
-              </w:rPr>
-              <w:t xml:space="preserve"> </w:t>
-            </w:r>
-          </w:p>
-        </w:tc>
-        <w:tc>
-          <w:tcPr>
-            <w:tcW w:type="dxa" w:w="1361"/>
-          </w:tcPr>
-          <w:p>
-            <w:pPr>
-              <w:spacing w:after="0" w:before="0" w:line="240" w:lineRule="auto"/>
-              <w:jc w:val="left"/>
-            </w:pPr>
-            <w:r/>
-            <w:r>
-              <w:rPr>
-                <w:rFonts w:ascii="TH Sarabun New" w:hAnsi="TH Sarabun New" w:cs="TH Sarabun New"/>
-                <w:b w:val="0"/>
-                <w:sz w:val="24"/>
-              </w:rPr>
-              <w:t xml:space="preserve"> </w:t>
-            </w:r>
-          </w:p>
-          <w:p>
-            <w:pPr>
-              <w:spacing w:after="0" w:before="0" w:line="240" w:lineRule="auto"/>
-              <w:jc w:val="left"/>
-            </w:pPr>
-            <w:r>
-              <w:rPr>
-                <w:rFonts w:ascii="TH Sarabun New" w:hAnsi="TH Sarabun New" w:cs="TH Sarabun New"/>
-                <w:b w:val="0"/>
-                <w:sz w:val="24"/>
-              </w:rPr>
-              <w:t xml:space="preserve"> </w:t>
-            </w:r>
-          </w:p>
-        </w:tc>
-      </w:tr>
-      <w:tr>
-        <w:trPr>
-          <w:trHeight w:val="520" w:hRule="atLeast"/>
-        </w:trPr>
-        <w:tc>
-          <w:tcPr>
-            <w:tcW w:type="dxa" w:w="1474"/>
-          </w:tcPr>
-          <w:p>
-            <w:pPr>
-              <w:spacing w:after="0" w:before="0" w:line="240" w:lineRule="auto"/>
-              <w:jc w:val="left"/>
-            </w:pPr>
-            <w:r/>
-            <w:r>
-              <w:rPr>
-                <w:rFonts w:ascii="TH Sarabun New" w:hAnsi="TH Sarabun New" w:cs="TH Sarabun New"/>
-                <w:b w:val="0"/>
-                <w:sz w:val="24"/>
-              </w:rPr>
-              <w:t xml:space="preserve"> </w:t>
-            </w:r>
-          </w:p>
-          <w:p>
-            <w:pPr>
-              <w:spacing w:after="0" w:before="0" w:line="240" w:lineRule="auto"/>
-              <w:jc w:val="left"/>
-            </w:pPr>
-            <w:r>
-              <w:rPr>
-                <w:rFonts w:ascii="TH Sarabun New" w:hAnsi="TH Sarabun New" w:cs="TH Sarabun New"/>
-                <w:b w:val="0"/>
-                <w:sz w:val="24"/>
-              </w:rPr>
-              <w:t xml:space="preserve"> </w:t>
-            </w:r>
-          </w:p>
-        </w:tc>
-        <w:tc>
-          <w:tcPr>
-            <w:tcW w:type="dxa" w:w="2211"/>
-          </w:tcPr>
-          <w:p>
-            <w:pPr>
-              <w:spacing w:after="0" w:before="0" w:line="240" w:lineRule="auto"/>
-              <w:jc w:val="left"/>
-            </w:pPr>
-            <w:r/>
-            <w:r>
-              <w:rPr>
-                <w:rFonts w:ascii="TH Sarabun New" w:hAnsi="TH Sarabun New" w:cs="TH Sarabun New"/>
-                <w:b w:val="0"/>
-                <w:sz w:val="24"/>
-              </w:rPr>
-              <w:t xml:space="preserve"> </w:t>
-            </w:r>
-          </w:p>
-          <w:p>
-            <w:pPr>
-              <w:spacing w:after="0" w:before="0" w:line="240" w:lineRule="auto"/>
-              <w:jc w:val="left"/>
-            </w:pPr>
-            <w:r>
-              <w:rPr>
-                <w:rFonts w:ascii="TH Sarabun New" w:hAnsi="TH Sarabun New" w:cs="TH Sarabun New"/>
-                <w:b w:val="0"/>
-                <w:sz w:val="24"/>
-              </w:rPr>
-              <w:t xml:space="preserve"> </w:t>
-            </w:r>
-          </w:p>
-        </w:tc>
-        <w:tc>
-          <w:tcPr>
-            <w:tcW w:type="dxa" w:w="624"/>
-          </w:tcPr>
-          <w:p>
-            <w:pPr>
-              <w:spacing w:after="0" w:before="0" w:line="240" w:lineRule="auto"/>
-              <w:jc w:val="left"/>
-            </w:pPr>
-            <w:r/>
-            <w:r>
-              <w:rPr>
-                <w:rFonts w:ascii="TH Sarabun New" w:hAnsi="TH Sarabun New" w:cs="TH Sarabun New"/>
-                <w:b w:val="0"/>
-                <w:sz w:val="24"/>
-              </w:rPr>
-              <w:t xml:space="preserve"> </w:t>
-            </w:r>
-          </w:p>
-          <w:p>
-            <w:pPr>
-              <w:spacing w:after="0" w:before="0" w:line="240" w:lineRule="auto"/>
-              <w:jc w:val="left"/>
-            </w:pPr>
-            <w:r>
-              <w:rPr>
-                <w:rFonts w:ascii="TH Sarabun New" w:hAnsi="TH Sarabun New" w:cs="TH Sarabun New"/>
-                <w:b w:val="0"/>
-                <w:sz w:val="24"/>
-              </w:rPr>
-              <w:t xml:space="preserve"> </w:t>
-            </w:r>
-          </w:p>
-        </w:tc>
-        <w:tc>
-          <w:tcPr>
-            <w:tcW w:type="dxa" w:w="794"/>
-          </w:tcPr>
-          <w:p>
-            <w:pPr>
-              <w:spacing w:after="0" w:before="0" w:line="240" w:lineRule="auto"/>
-              <w:jc w:val="left"/>
-            </w:pPr>
-            <w:r/>
-            <w:r>
-              <w:rPr>
-                <w:rFonts w:ascii="TH Sarabun New" w:hAnsi="TH Sarabun New" w:cs="TH Sarabun New"/>
-                <w:b w:val="0"/>
-                <w:sz w:val="24"/>
-              </w:rPr>
-              <w:t xml:space="preserve"> </w:t>
-            </w:r>
-          </w:p>
-          <w:p>
-            <w:pPr>
-              <w:spacing w:after="0" w:before="0" w:line="240" w:lineRule="auto"/>
-              <w:jc w:val="left"/>
-            </w:pPr>
-            <w:r>
-              <w:rPr>
-                <w:rFonts w:ascii="TH Sarabun New" w:hAnsi="TH Sarabun New" w:cs="TH Sarabun New"/>
-                <w:b w:val="0"/>
-                <w:sz w:val="24"/>
-              </w:rPr>
-              <w:t xml:space="preserve"> </w:t>
-            </w:r>
-          </w:p>
-        </w:tc>
-        <w:tc>
-          <w:tcPr>
-            <w:tcW w:type="dxa" w:w="2438"/>
-          </w:tcPr>
-          <w:p>
-            <w:pPr>
-              <w:spacing w:after="0" w:before="0" w:line="240" w:lineRule="auto"/>
-              <w:jc w:val="left"/>
-            </w:pPr>
-            <w:r/>
-            <w:r>
-              <w:rPr>
-                <w:rFonts w:ascii="TH Sarabun New" w:hAnsi="TH Sarabun New" w:cs="TH Sarabun New"/>
-                <w:b w:val="0"/>
-                <w:sz w:val="24"/>
-              </w:rPr>
-              <w:t xml:space="preserve"> </w:t>
-            </w:r>
-          </w:p>
-          <w:p>
-            <w:pPr>
-              <w:spacing w:after="0" w:before="0" w:line="240" w:lineRule="auto"/>
-              <w:jc w:val="left"/>
-            </w:pPr>
-            <w:r>
-              <w:rPr>
-                <w:rFonts w:ascii="TH Sarabun New" w:hAnsi="TH Sarabun New" w:cs="TH Sarabun New"/>
-                <w:b w:val="0"/>
-                <w:sz w:val="24"/>
-              </w:rPr>
-              <w:t xml:space="preserve"> </w:t>
-            </w:r>
-          </w:p>
-        </w:tc>
-        <w:tc>
-          <w:tcPr>
-            <w:tcW w:type="dxa" w:w="2665"/>
-          </w:tcPr>
-          <w:p>
-            <w:pPr>
-              <w:spacing w:after="0" w:before="0" w:line="240" w:lineRule="auto"/>
-              <w:jc w:val="left"/>
-            </w:pPr>
-            <w:r/>
-            <w:r>
-              <w:rPr>
-                <w:rFonts w:ascii="TH Sarabun New" w:hAnsi="TH Sarabun New" w:cs="TH Sarabun New"/>
-                <w:b w:val="0"/>
-                <w:sz w:val="24"/>
-              </w:rPr>
-              <w:t xml:space="preserve"> </w:t>
-            </w:r>
-          </w:p>
-          <w:p>
-            <w:pPr>
-              <w:spacing w:after="0" w:before="0" w:line="240" w:lineRule="auto"/>
-              <w:jc w:val="left"/>
-            </w:pPr>
-            <w:r>
-              <w:rPr>
-                <w:rFonts w:ascii="TH Sarabun New" w:hAnsi="TH Sarabun New" w:cs="TH Sarabun New"/>
-                <w:b w:val="0"/>
-                <w:sz w:val="24"/>
-              </w:rPr>
-              <w:t xml:space="preserve"> </w:t>
-            </w:r>
-          </w:p>
-        </w:tc>
-        <w:tc>
-          <w:tcPr>
-            <w:tcW w:type="dxa" w:w="1871"/>
-          </w:tcPr>
-          <w:p>
-            <w:pPr>
-              <w:spacing w:after="0" w:before="0" w:line="240" w:lineRule="auto"/>
-              <w:jc w:val="left"/>
-            </w:pPr>
-            <w:r/>
-            <w:r>
-              <w:rPr>
-                <w:rFonts w:ascii="TH Sarabun New" w:hAnsi="TH Sarabun New" w:cs="TH Sarabun New"/>
-                <w:b w:val="0"/>
-                <w:sz w:val="24"/>
-              </w:rPr>
-              <w:t xml:space="preserve"> </w:t>
-            </w:r>
-          </w:p>
-          <w:p>
-            <w:pPr>
-              <w:spacing w:after="0" w:before="0" w:line="240" w:lineRule="auto"/>
-              <w:jc w:val="left"/>
-            </w:pPr>
-            <w:r>
-              <w:rPr>
-                <w:rFonts w:ascii="TH Sarabun New" w:hAnsi="TH Sarabun New" w:cs="TH Sarabun New"/>
-                <w:b w:val="0"/>
-                <w:sz w:val="24"/>
-              </w:rPr>
-              <w:t xml:space="preserve"> </w:t>
-            </w:r>
-          </w:p>
-        </w:tc>
-        <w:tc>
-          <w:tcPr>
-            <w:tcW w:type="dxa" w:w="1701"/>
-          </w:tcPr>
-          <w:p>
-            <w:pPr>
-              <w:spacing w:after="0" w:before="0" w:line="240" w:lineRule="auto"/>
-              <w:jc w:val="left"/>
-            </w:pPr>
-            <w:r/>
-            <w:r>
-              <w:rPr>
-                <w:rFonts w:ascii="TH Sarabun New" w:hAnsi="TH Sarabun New" w:cs="TH Sarabun New"/>
-                <w:b w:val="0"/>
-                <w:sz w:val="24"/>
-              </w:rPr>
-              <w:t xml:space="preserve"> </w:t>
-            </w:r>
-          </w:p>
-          <w:p>
-            <w:pPr>
-              <w:spacing w:after="0" w:before="0" w:line="240" w:lineRule="auto"/>
-              <w:jc w:val="left"/>
-            </w:pPr>
-            <w:r>
-              <w:rPr>
-                <w:rFonts w:ascii="TH Sarabun New" w:hAnsi="TH Sarabun New" w:cs="TH Sarabun New"/>
-                <w:b w:val="0"/>
-                <w:sz w:val="24"/>
-              </w:rPr>
-              <w:t xml:space="preserve"> </w:t>
-            </w:r>
-          </w:p>
-        </w:tc>
-        <w:tc>
-          <w:tcPr>
-            <w:tcW w:type="dxa" w:w="1361"/>
-          </w:tcPr>
-          <w:p>
-            <w:pPr>
-              <w:spacing w:after="0" w:before="0" w:line="240" w:lineRule="auto"/>
-              <w:jc w:val="left"/>
-            </w:pPr>
-            <w:r/>
-            <w:r>
-              <w:rPr>
-                <w:rFonts w:ascii="TH Sarabun New" w:hAnsi="TH Sarabun New" w:cs="TH Sarabun New"/>
-                <w:b w:val="0"/>
-                <w:sz w:val="24"/>
-              </w:rPr>
-              <w:t xml:space="preserve"> </w:t>
-            </w:r>
-          </w:p>
-          <w:p>
-            <w:pPr>
-              <w:spacing w:after="0" w:before="0" w:line="240" w:lineRule="auto"/>
-              <w:jc w:val="left"/>
-            </w:pPr>
-            <w:r>
-              <w:rPr>
-                <w:rFonts w:ascii="TH Sarabun New" w:hAnsi="TH Sarabun New" w:cs="TH Sarabun New"/>
-                <w:b w:val="0"/>
-                <w:sz w:val="24"/>
-              </w:rPr>
-              <w:t xml:space="preserve"> </w:t>
-            </w:r>
-          </w:p>
-        </w:tc>
-      </w:tr>
-      <w:tr>
-        <w:trPr>
-          <w:trHeight w:val="520" w:hRule="atLeast"/>
-        </w:trPr>
-        <w:tc>
-          <w:tcPr>
-            <w:tcW w:type="dxa" w:w="1474"/>
-          </w:tcPr>
-          <w:p>
-            <w:pPr>
-              <w:spacing w:after="0" w:before="0" w:line="240" w:lineRule="auto"/>
-              <w:jc w:val="left"/>
-            </w:pPr>
-            <w:r/>
-            <w:r>
-              <w:rPr>
-                <w:rFonts w:ascii="TH Sarabun New" w:hAnsi="TH Sarabun New" w:cs="TH Sarabun New"/>
-                <w:b w:val="0"/>
-                <w:sz w:val="24"/>
-              </w:rPr>
-              <w:t xml:space="preserve"> </w:t>
-            </w:r>
-          </w:p>
-          <w:p>
-            <w:pPr>
-              <w:spacing w:after="0" w:before="0" w:line="240" w:lineRule="auto"/>
-              <w:jc w:val="left"/>
-            </w:pPr>
-            <w:r>
-              <w:rPr>
-                <w:rFonts w:ascii="TH Sarabun New" w:hAnsi="TH Sarabun New" w:cs="TH Sarabun New"/>
-                <w:b w:val="0"/>
-                <w:sz w:val="24"/>
-              </w:rPr>
-              <w:t xml:space="preserve"> </w:t>
-            </w:r>
-          </w:p>
-        </w:tc>
-        <w:tc>
-          <w:tcPr>
-            <w:tcW w:type="dxa" w:w="2211"/>
-          </w:tcPr>
-          <w:p>
-            <w:pPr>
-              <w:spacing w:after="0" w:before="0" w:line="240" w:lineRule="auto"/>
-              <w:jc w:val="left"/>
-            </w:pPr>
-            <w:r/>
-            <w:r>
-              <w:rPr>
-                <w:rFonts w:ascii="TH Sarabun New" w:hAnsi="TH Sarabun New" w:cs="TH Sarabun New"/>
-                <w:b w:val="0"/>
-                <w:sz w:val="24"/>
-              </w:rPr>
-              <w:t xml:space="preserve"> </w:t>
-            </w:r>
-          </w:p>
-          <w:p>
-            <w:pPr>
-              <w:spacing w:after="0" w:before="0" w:line="240" w:lineRule="auto"/>
-              <w:jc w:val="left"/>
-            </w:pPr>
-            <w:r>
-              <w:rPr>
-                <w:rFonts w:ascii="TH Sarabun New" w:hAnsi="TH Sarabun New" w:cs="TH Sarabun New"/>
-                <w:b w:val="0"/>
-                <w:sz w:val="24"/>
-              </w:rPr>
-              <w:t xml:space="preserve"> </w:t>
-            </w:r>
-          </w:p>
-        </w:tc>
-        <w:tc>
-          <w:tcPr>
-            <w:tcW w:type="dxa" w:w="624"/>
-          </w:tcPr>
-          <w:p>
-            <w:pPr>
-              <w:spacing w:after="0" w:before="0" w:line="240" w:lineRule="auto"/>
-              <w:jc w:val="left"/>
-            </w:pPr>
-            <w:r/>
-            <w:r>
-              <w:rPr>
-                <w:rFonts w:ascii="TH Sarabun New" w:hAnsi="TH Sarabun New" w:cs="TH Sarabun New"/>
-                <w:b w:val="0"/>
-                <w:sz w:val="24"/>
-              </w:rPr>
-              <w:t xml:space="preserve"> </w:t>
-            </w:r>
-          </w:p>
-          <w:p>
-            <w:pPr>
-              <w:spacing w:after="0" w:before="0" w:line="240" w:lineRule="auto"/>
-              <w:jc w:val="left"/>
-            </w:pPr>
-            <w:r>
-              <w:rPr>
-                <w:rFonts w:ascii="TH Sarabun New" w:hAnsi="TH Sarabun New" w:cs="TH Sarabun New"/>
-                <w:b w:val="0"/>
-                <w:sz w:val="24"/>
-              </w:rPr>
-              <w:t xml:space="preserve"> </w:t>
-            </w:r>
-          </w:p>
-        </w:tc>
-        <w:tc>
-          <w:tcPr>
-            <w:tcW w:type="dxa" w:w="794"/>
-          </w:tcPr>
-          <w:p>
-            <w:pPr>
-              <w:spacing w:after="0" w:before="0" w:line="240" w:lineRule="auto"/>
-              <w:jc w:val="left"/>
-            </w:pPr>
-            <w:r/>
-            <w:r>
-              <w:rPr>
-                <w:rFonts w:ascii="TH Sarabun New" w:hAnsi="TH Sarabun New" w:cs="TH Sarabun New"/>
-                <w:b w:val="0"/>
-                <w:sz w:val="24"/>
-              </w:rPr>
-              <w:t xml:space="preserve"> </w:t>
-            </w:r>
-          </w:p>
-          <w:p>
-            <w:pPr>
-              <w:spacing w:after="0" w:before="0" w:line="240" w:lineRule="auto"/>
-              <w:jc w:val="left"/>
-            </w:pPr>
-            <w:r>
-              <w:rPr>
-                <w:rFonts w:ascii="TH Sarabun New" w:hAnsi="TH Sarabun New" w:cs="TH Sarabun New"/>
-                <w:b w:val="0"/>
-                <w:sz w:val="24"/>
-              </w:rPr>
-              <w:t xml:space="preserve"> </w:t>
-            </w:r>
-          </w:p>
-        </w:tc>
-        <w:tc>
-          <w:tcPr>
-            <w:tcW w:type="dxa" w:w="2438"/>
-          </w:tcPr>
-          <w:p>
-            <w:pPr>
-              <w:spacing w:after="0" w:before="0" w:line="240" w:lineRule="auto"/>
-              <w:jc w:val="left"/>
-            </w:pPr>
-            <w:r/>
-            <w:r>
-              <w:rPr>
-                <w:rFonts w:ascii="TH Sarabun New" w:hAnsi="TH Sarabun New" w:cs="TH Sarabun New"/>
-                <w:b w:val="0"/>
-                <w:sz w:val="24"/>
-              </w:rPr>
-              <w:t xml:space="preserve"> </w:t>
-            </w:r>
-          </w:p>
-          <w:p>
-            <w:pPr>
-              <w:spacing w:after="0" w:before="0" w:line="240" w:lineRule="auto"/>
-              <w:jc w:val="left"/>
-            </w:pPr>
-            <w:r>
-              <w:rPr>
-                <w:rFonts w:ascii="TH Sarabun New" w:hAnsi="TH Sarabun New" w:cs="TH Sarabun New"/>
-                <w:b w:val="0"/>
-                <w:sz w:val="24"/>
-              </w:rPr>
-              <w:t xml:space="preserve"> </w:t>
-            </w:r>
-          </w:p>
-        </w:tc>
-        <w:tc>
-          <w:tcPr>
-            <w:tcW w:type="dxa" w:w="2665"/>
-          </w:tcPr>
-          <w:p>
-            <w:pPr>
-              <w:spacing w:after="0" w:before="0" w:line="240" w:lineRule="auto"/>
-              <w:jc w:val="left"/>
-            </w:pPr>
-            <w:r/>
-            <w:r>
-              <w:rPr>
-                <w:rFonts w:ascii="TH Sarabun New" w:hAnsi="TH Sarabun New" w:cs="TH Sarabun New"/>
-                <w:b w:val="0"/>
-                <w:sz w:val="24"/>
-              </w:rPr>
-              <w:t xml:space="preserve"> </w:t>
-            </w:r>
-          </w:p>
-          <w:p>
-            <w:pPr>
-              <w:spacing w:after="0" w:before="0" w:line="240" w:lineRule="auto"/>
-              <w:jc w:val="left"/>
-            </w:pPr>
-            <w:r>
-              <w:rPr>
-                <w:rFonts w:ascii="TH Sarabun New" w:hAnsi="TH Sarabun New" w:cs="TH Sarabun New"/>
-                <w:b w:val="0"/>
-                <w:sz w:val="24"/>
-              </w:rPr>
-              <w:t xml:space="preserve"> </w:t>
-            </w:r>
-          </w:p>
-        </w:tc>
-        <w:tc>
-          <w:tcPr>
-            <w:tcW w:type="dxa" w:w="1871"/>
-          </w:tcPr>
-          <w:p>
-            <w:pPr>
-              <w:spacing w:after="0" w:before="0" w:line="240" w:lineRule="auto"/>
-              <w:jc w:val="left"/>
-            </w:pPr>
-            <w:r/>
-            <w:r>
-              <w:rPr>
-                <w:rFonts w:ascii="TH Sarabun New" w:hAnsi="TH Sarabun New" w:cs="TH Sarabun New"/>
-                <w:b w:val="0"/>
-                <w:sz w:val="24"/>
-              </w:rPr>
-              <w:t xml:space="preserve"> </w:t>
-            </w:r>
-          </w:p>
-          <w:p>
-            <w:pPr>
-              <w:spacing w:after="0" w:before="0" w:line="240" w:lineRule="auto"/>
-              <w:jc w:val="left"/>
-            </w:pPr>
-            <w:r>
-              <w:rPr>
-                <w:rFonts w:ascii="TH Sarabun New" w:hAnsi="TH Sarabun New" w:cs="TH Sarabun New"/>
-                <w:b w:val="0"/>
-                <w:sz w:val="24"/>
-              </w:rPr>
-              <w:t xml:space="preserve"> </w:t>
-            </w:r>
-          </w:p>
-        </w:tc>
-        <w:tc>
-          <w:tcPr>
-            <w:tcW w:type="dxa" w:w="1701"/>
-          </w:tcPr>
-          <w:p>
-            <w:pPr>
-              <w:spacing w:after="0" w:before="0" w:line="240" w:lineRule="auto"/>
-              <w:jc w:val="left"/>
-            </w:pPr>
-            <w:r/>
-            <w:r>
-              <w:rPr>
-                <w:rFonts w:ascii="TH Sarabun New" w:hAnsi="TH Sarabun New" w:cs="TH Sarabun New"/>
-                <w:b w:val="0"/>
-                <w:sz w:val="24"/>
-              </w:rPr>
-              <w:t xml:space="preserve"> </w:t>
-            </w:r>
-          </w:p>
-          <w:p>
-            <w:pPr>
-              <w:spacing w:after="0" w:before="0" w:line="240" w:lineRule="auto"/>
-              <w:jc w:val="left"/>
-            </w:pPr>
-            <w:r>
-              <w:rPr>
-                <w:rFonts w:ascii="TH Sarabun New" w:hAnsi="TH Sarabun New" w:cs="TH Sarabun New"/>
-                <w:b w:val="0"/>
-                <w:sz w:val="24"/>
-              </w:rPr>
-              <w:t xml:space="preserve"> </w:t>
-            </w:r>
-          </w:p>
-        </w:tc>
-        <w:tc>
-          <w:tcPr>
-            <w:tcW w:type="dxa" w:w="1361"/>
-          </w:tcPr>
-          <w:p>
-            <w:pPr>
-              <w:spacing w:after="0" w:before="0" w:line="240" w:lineRule="auto"/>
-              <w:jc w:val="left"/>
-            </w:pPr>
-            <w:r/>
-            <w:r>
-              <w:rPr>
-                <w:rFonts w:ascii="TH Sarabun New" w:hAnsi="TH Sarabun New" w:cs="TH Sarabun New"/>
-                <w:b w:val="0"/>
-                <w:sz w:val="24"/>
-              </w:rPr>
-              <w:t xml:space="preserve"> </w:t>
-            </w:r>
-          </w:p>
-          <w:p>
-            <w:pPr>
-              <w:spacing w:after="0" w:before="0" w:line="240" w:lineRule="auto"/>
-              <w:jc w:val="left"/>
-            </w:pPr>
-            <w:r>
-              <w:rPr>
-                <w:rFonts w:ascii="TH Sarabun New" w:hAnsi="TH Sarabun New" w:cs="TH Sarabun New"/>
-                <w:b w:val="0"/>
-                <w:sz w:val="24"/>
-              </w:rPr>
-              <w:t xml:space="preserve"> </w:t>
-            </w:r>
-          </w:p>
-        </w:tc>
-      </w:tr>
-      <w:tr>
-        <w:trPr>
-          <w:trHeight w:val="520" w:hRule="atLeast"/>
-        </w:trPr>
-        <w:tc>
-          <w:tcPr>
-            <w:tcW w:type="dxa" w:w="1474"/>
-          </w:tcPr>
-          <w:p>
-            <w:pPr>
-              <w:spacing w:after="0" w:before="0" w:line="240" w:lineRule="auto"/>
-              <w:jc w:val="left"/>
-            </w:pPr>
-            <w:r/>
-            <w:r>
-              <w:rPr>
-                <w:rFonts w:ascii="TH Sarabun New" w:hAnsi="TH Sarabun New" w:cs="TH Sarabun New"/>
-                <w:b w:val="0"/>
-                <w:sz w:val="24"/>
-              </w:rPr>
-              <w:t xml:space="preserve"> </w:t>
-            </w:r>
-          </w:p>
-          <w:p>
-            <w:pPr>
-              <w:spacing w:after="0" w:before="0" w:line="240" w:lineRule="auto"/>
-              <w:jc w:val="left"/>
-            </w:pPr>
-            <w:r>
-              <w:rPr>
-                <w:rFonts w:ascii="TH Sarabun New" w:hAnsi="TH Sarabun New" w:cs="TH Sarabun New"/>
-                <w:b w:val="0"/>
-                <w:sz w:val="24"/>
-              </w:rPr>
-              <w:t xml:space="preserve"> </w:t>
-            </w:r>
-          </w:p>
-        </w:tc>
-        <w:tc>
-          <w:tcPr>
-            <w:tcW w:type="dxa" w:w="2211"/>
-          </w:tcPr>
-          <w:p>
-            <w:pPr>
-              <w:spacing w:after="0" w:before="0" w:line="240" w:lineRule="auto"/>
-              <w:jc w:val="left"/>
-            </w:pPr>
-            <w:r/>
-            <w:r>
-              <w:rPr>
-                <w:rFonts w:ascii="TH Sarabun New" w:hAnsi="TH Sarabun New" w:cs="TH Sarabun New"/>
-                <w:b w:val="0"/>
-                <w:sz w:val="24"/>
-              </w:rPr>
-              <w:t xml:space="preserve"> </w:t>
-            </w:r>
-          </w:p>
-          <w:p>
-            <w:pPr>
-              <w:spacing w:after="0" w:before="0" w:line="240" w:lineRule="auto"/>
-              <w:jc w:val="left"/>
-            </w:pPr>
-            <w:r>
-              <w:rPr>
-                <w:rFonts w:ascii="TH Sarabun New" w:hAnsi="TH Sarabun New" w:cs="TH Sarabun New"/>
-                <w:b w:val="0"/>
-                <w:sz w:val="24"/>
-              </w:rPr>
-              <w:t xml:space="preserve"> </w:t>
-            </w:r>
-          </w:p>
-        </w:tc>
-        <w:tc>
-          <w:tcPr>
-            <w:tcW w:type="dxa" w:w="624"/>
-          </w:tcPr>
-          <w:p>
-            <w:pPr>
-              <w:spacing w:after="0" w:before="0" w:line="240" w:lineRule="auto"/>
-              <w:jc w:val="left"/>
-            </w:pPr>
-            <w:r/>
-            <w:r>
-              <w:rPr>
-                <w:rFonts w:ascii="TH Sarabun New" w:hAnsi="TH Sarabun New" w:cs="TH Sarabun New"/>
-                <w:b w:val="0"/>
-                <w:sz w:val="24"/>
-              </w:rPr>
-              <w:t xml:space="preserve"> </w:t>
-            </w:r>
-          </w:p>
-          <w:p>
-            <w:pPr>
-              <w:spacing w:after="0" w:before="0" w:line="240" w:lineRule="auto"/>
-              <w:jc w:val="left"/>
-            </w:pPr>
-            <w:r>
-              <w:rPr>
-                <w:rFonts w:ascii="TH Sarabun New" w:hAnsi="TH Sarabun New" w:cs="TH Sarabun New"/>
-                <w:b w:val="0"/>
-                <w:sz w:val="24"/>
-              </w:rPr>
-              <w:t xml:space="preserve"> </w:t>
-            </w:r>
-          </w:p>
-        </w:tc>
-        <w:tc>
-          <w:tcPr>
-            <w:tcW w:type="dxa" w:w="794"/>
-          </w:tcPr>
-          <w:p>
-            <w:pPr>
-              <w:spacing w:after="0" w:before="0" w:line="240" w:lineRule="auto"/>
-              <w:jc w:val="left"/>
-            </w:pPr>
-            <w:r/>
-            <w:r>
-              <w:rPr>
-                <w:rFonts w:ascii="TH Sarabun New" w:hAnsi="TH Sarabun New" w:cs="TH Sarabun New"/>
-                <w:b w:val="0"/>
-                <w:sz w:val="24"/>
-              </w:rPr>
-              <w:t xml:space="preserve"> </w:t>
-            </w:r>
-          </w:p>
-          <w:p>
-            <w:pPr>
-              <w:spacing w:after="0" w:before="0" w:line="240" w:lineRule="auto"/>
-              <w:jc w:val="left"/>
-            </w:pPr>
-            <w:r>
-              <w:rPr>
-                <w:rFonts w:ascii="TH Sarabun New" w:hAnsi="TH Sarabun New" w:cs="TH Sarabun New"/>
-                <w:b w:val="0"/>
-                <w:sz w:val="24"/>
-              </w:rPr>
-              <w:t xml:space="preserve"> </w:t>
-            </w:r>
-          </w:p>
-        </w:tc>
-        <w:tc>
-          <w:tcPr>
-            <w:tcW w:type="dxa" w:w="2438"/>
-          </w:tcPr>
-          <w:p>
-            <w:pPr>
-              <w:spacing w:after="0" w:before="0" w:line="240" w:lineRule="auto"/>
-              <w:jc w:val="left"/>
-            </w:pPr>
-            <w:r/>
-            <w:r>
-              <w:rPr>
-                <w:rFonts w:ascii="TH Sarabun New" w:hAnsi="TH Sarabun New" w:cs="TH Sarabun New"/>
-                <w:b w:val="0"/>
-                <w:sz w:val="24"/>
-              </w:rPr>
-              <w:t xml:space="preserve"> </w:t>
-            </w:r>
-          </w:p>
-          <w:p>
-            <w:pPr>
-              <w:spacing w:after="0" w:before="0" w:line="240" w:lineRule="auto"/>
-              <w:jc w:val="left"/>
-            </w:pPr>
-            <w:r>
-              <w:rPr>
-                <w:rFonts w:ascii="TH Sarabun New" w:hAnsi="TH Sarabun New" w:cs="TH Sarabun New"/>
-                <w:b w:val="0"/>
-                <w:sz w:val="24"/>
-              </w:rPr>
-              <w:t xml:space="preserve"> </w:t>
-            </w:r>
-          </w:p>
-        </w:tc>
-        <w:tc>
-          <w:tcPr>
-            <w:tcW w:type="dxa" w:w="2665"/>
-          </w:tcPr>
-          <w:p>
-            <w:pPr>
-              <w:spacing w:after="0" w:before="0" w:line="240" w:lineRule="auto"/>
-              <w:jc w:val="left"/>
-            </w:pPr>
-            <w:r/>
-            <w:r>
-              <w:rPr>
-                <w:rFonts w:ascii="TH Sarabun New" w:hAnsi="TH Sarabun New" w:cs="TH Sarabun New"/>
-                <w:b w:val="0"/>
-                <w:sz w:val="24"/>
-              </w:rPr>
-              <w:t xml:space="preserve"> </w:t>
-            </w:r>
-          </w:p>
-          <w:p>
-            <w:pPr>
-              <w:spacing w:after="0" w:before="0" w:line="240" w:lineRule="auto"/>
-              <w:jc w:val="left"/>
-            </w:pPr>
-            <w:r>
-              <w:rPr>
-                <w:rFonts w:ascii="TH Sarabun New" w:hAnsi="TH Sarabun New" w:cs="TH Sarabun New"/>
-                <w:b w:val="0"/>
-                <w:sz w:val="24"/>
-              </w:rPr>
-              <w:t xml:space="preserve"> </w:t>
-            </w:r>
-          </w:p>
-        </w:tc>
-        <w:tc>
-          <w:tcPr>
-            <w:tcW w:type="dxa" w:w="1871"/>
-          </w:tcPr>
-          <w:p>
-            <w:pPr>
-              <w:spacing w:after="0" w:before="0" w:line="240" w:lineRule="auto"/>
-              <w:jc w:val="left"/>
-            </w:pPr>
-            <w:r/>
-            <w:r>
-              <w:rPr>
-                <w:rFonts w:ascii="TH Sarabun New" w:hAnsi="TH Sarabun New" w:cs="TH Sarabun New"/>
-                <w:b w:val="0"/>
-                <w:sz w:val="24"/>
-              </w:rPr>
-              <w:t xml:space="preserve"> </w:t>
-            </w:r>
-          </w:p>
-          <w:p>
-            <w:pPr>
-              <w:spacing w:after="0" w:before="0" w:line="240" w:lineRule="auto"/>
-              <w:jc w:val="left"/>
-            </w:pPr>
-            <w:r>
-              <w:rPr>
-                <w:rFonts w:ascii="TH Sarabun New" w:hAnsi="TH Sarabun New" w:cs="TH Sarabun New"/>
-                <w:b w:val="0"/>
-                <w:sz w:val="24"/>
-              </w:rPr>
-              <w:t xml:space="preserve"> </w:t>
-            </w:r>
-          </w:p>
-        </w:tc>
-        <w:tc>
-          <w:tcPr>
-            <w:tcW w:type="dxa" w:w="1701"/>
-          </w:tcPr>
-          <w:p>
-            <w:pPr>
-              <w:spacing w:after="0" w:before="0" w:line="240" w:lineRule="auto"/>
-              <w:jc w:val="left"/>
-            </w:pPr>
-            <w:r/>
-            <w:r>
-              <w:rPr>
-                <w:rFonts w:ascii="TH Sarabun New" w:hAnsi="TH Sarabun New" w:cs="TH Sarabun New"/>
-                <w:b w:val="0"/>
-                <w:sz w:val="24"/>
-              </w:rPr>
-              <w:t xml:space="preserve"> </w:t>
-            </w:r>
-          </w:p>
-          <w:p>
-            <w:pPr>
-              <w:spacing w:after="0" w:before="0" w:line="240" w:lineRule="auto"/>
-              <w:jc w:val="left"/>
-            </w:pPr>
-            <w:r>
-              <w:rPr>
-                <w:rFonts w:ascii="TH Sarabun New" w:hAnsi="TH Sarabun New" w:cs="TH Sarabun New"/>
-                <w:b w:val="0"/>
-                <w:sz w:val="24"/>
-              </w:rPr>
-              <w:t xml:space="preserve"> </w:t>
-            </w:r>
-          </w:p>
-        </w:tc>
-        <w:tc>
-          <w:tcPr>
-            <w:tcW w:type="dxa" w:w="1361"/>
-          </w:tcPr>
-          <w:p>
-            <w:pPr>
-              <w:spacing w:after="0" w:before="0" w:line="240" w:lineRule="auto"/>
-              <w:jc w:val="left"/>
-            </w:pPr>
-            <w:r/>
-            <w:r>
-              <w:rPr>
-                <w:rFonts w:ascii="TH Sarabun New" w:hAnsi="TH Sarabun New" w:cs="TH Sarabun New"/>
-                <w:b w:val="0"/>
-                <w:sz w:val="24"/>
-              </w:rPr>
-              <w:t xml:space="preserve"> </w:t>
-            </w:r>
-          </w:p>
-          <w:p>
-            <w:pPr>
-              <w:spacing w:after="0" w:before="0" w:line="240" w:lineRule="auto"/>
-              <w:jc w:val="left"/>
-            </w:pPr>
-            <w:r>
-              <w:rPr>
-                <w:rFonts w:ascii="TH Sarabun New" w:hAnsi="TH Sarabun New" w:cs="TH Sarabun New"/>
-                <w:b w:val="0"/>
-                <w:sz w:val="24"/>
-              </w:rPr>
-              <w:t xml:space="preserve"> </w:t>
-            </w:r>
-          </w:p>
+          <w:p/>
         </w:tc>
       </w:tr>
       <w:tr>
@@ -3547,14 +877,15 @@
               <w:spacing w:after="0" w:before="0" w:line="240" w:lineRule="auto"/>
               <w:jc w:val="center"/>
             </w:pPr>
-            <w:r/>
+            <w:r>
+              <w:t>{{ totalDurationMin }}</w:t>
+            </w:r>
             <w:r>
               <w:rPr>
                 <w:rFonts w:ascii="TH Sarabun New" w:hAnsi="TH Sarabun New" w:cs="TH Sarabun New"/>
                 <w:b w:val="0"/>
                 <w:sz w:val="24"/>
               </w:rPr>
-              <w:t xml:space="preserve"> </w:t>
             </w:r>
           </w:p>
         </w:tc>
@@ -3624,17 +955,9 @@
       </w:r>
     </w:p>
     <w:p>
-      <w:pPr>
-        <w:spacing w:after="40" w:before="0" w:line="240" w:lineRule="auto"/>
-        <w:jc w:val="left"/>
-      </w:pPr>
+      <w:pPr/>
       <w:r>
-        <w:rPr>
-          <w:rFonts w:ascii="TH Sarabun New" w:hAnsi="TH Sarabun New" w:cs="TH Sarabun New"/>
-          <w:b w:val="0"/>
-          <w:sz w:val="26"/>
-        </w:rPr>
-        <w:t>PLO ........ : ...............................................................................................................</w:t>
+        <w:t>{%p for plo in PLOs %}</w:t>
       </w:r>
     </w:p>
     <w:p>
@@ -3648,7 +971,19 @@
           <w:b w:val="0"/>
           <w:sz w:val="26"/>
         </w:rPr>
-        <w:t>CLO ........ : ...............................................................................................................</w:t>
+        <w:t>PLO {{ plo.id }} : {{ plo.text }}</w:t>
+      </w:r>
+    </w:p>
+    <w:p>
+      <w:pPr/>
+      <w:r>
+        <w:t>{%p endfor %}</w:t>
+      </w:r>
+    </w:p>
+    <w:p>
+      <w:pPr/>
+      <w:r>
+        <w:t>{%p for clo in CLOs %}</w:t>
       </w:r>
     </w:p>
     <w:p>
@@ -3662,7 +997,13 @@
           <w:b w:val="0"/>
           <w:sz w:val="26"/>
         </w:rPr>
-        <w:t>CLO ........ : ...............................................................................................................</w:t>
+        <w:t>CLO {{ clo.id }} : {{ clo.text }}</w:t>
+      </w:r>
+    </w:p>
+    <w:p>
+      <w:pPr/>
+      <w:r>
+        <w:t>{%p endfor %}</w:t>
       </w:r>
     </w:p>
     <w:p>
@@ -3685,17 +1026,9 @@
       </w:r>
     </w:p>
     <w:p>
-      <w:pPr>
-        <w:spacing w:after="100" w:before="0" w:line="240" w:lineRule="auto"/>
-        <w:jc w:val="left"/>
-      </w:pPr>
+      <w:pPr/>
       <w:r>
-        <w:rPr>
-          <w:rFonts w:ascii="TH Sarabun New" w:hAnsi="TH Sarabun New" w:cs="TH Sarabun New"/>
-          <w:b w:val="0"/>
-          <w:sz w:val="28"/>
-        </w:rPr>
-        <w:t>.............................................................................................................................................</w:t>
+        <w:t>{%p for ref in references %}</w:t>
       </w:r>
     </w:p>
     <w:p>
@@ -3709,35 +1042,13 @@
           <w:b w:val="0"/>
           <w:sz w:val="28"/>
         </w:rPr>
-        <w:t>.............................................................................................................................................</w:t>
+        <w:t>{{ ref }}</w:t>
       </w:r>
     </w:p>
     <w:p>
-      <w:pPr>
-        <w:spacing w:after="100" w:before="0" w:line="240" w:lineRule="auto"/>
-        <w:jc w:val="left"/>
-      </w:pPr>
+      <w:pPr/>
       <w:r>
-        <w:rPr>
-          <w:rFonts w:ascii="TH Sarabun New" w:hAnsi="TH Sarabun New" w:cs="TH Sarabun New"/>
-          <w:b w:val="0"/>
-          <w:sz w:val="28"/>
-        </w:rPr>
-        <w:t>.............................................................................................................................................</w:t>
-      </w:r>
-    </w:p>
-    <w:p>
-      <w:pPr>
-        <w:spacing w:after="100" w:before="0" w:line="240" w:lineRule="auto"/>
-        <w:jc w:val="left"/>
-      </w:pPr>
-      <w:r>
-        <w:rPr>
-          <w:rFonts w:ascii="TH Sarabun New" w:hAnsi="TH Sarabun New" w:cs="TH Sarabun New"/>
-          <w:b w:val="0"/>
-          <w:sz w:val="28"/>
-        </w:rPr>
-        <w:t>.............................................................................................................................................</w:t>
+        <w:t>{%p endfor %}</w:t>
       </w:r>
     </w:p>
     <w:sectPr>

</xml_diff>